<commit_message>
Punto 1, 2 Word
Realice el Word, respondiendo a las preguntas del punto 2 y colocando las respectivas tablas que realizamos en el código del punto 1 y 2 tambien
</commit_message>
<xml_diff>
--- a/Tours_Marketing_Caso3.docx
+++ b/Tours_Marketing_Caso3.docx
@@ -683,7 +683,7 @@
           <w14:ligatures w14:val="standardContextual"/>
         </w:rPr>
         <w:drawing>
-          <wp:inline distT="0" distB="0" distL="0" distR="0" wp14:anchorId="63808AB8" wp14:editId="15C0AF3C">
+          <wp:inline distT="0" distB="0" distL="0" distR="0" wp14:anchorId="63808AB8" wp14:editId="174D9051">
             <wp:extent cx="4324952" cy="2076137"/>
             <wp:effectExtent l="0" t="0" r="0" b="0"/>
             <wp:docPr id="598485339" name="Imagen 1"/>
@@ -812,10 +812,10 @@
           <w14:ligatures w14:val="standardContextual"/>
         </w:rPr>
         <w:drawing>
-          <wp:inline distT="0" distB="0" distL="0" distR="0" wp14:anchorId="3424790D" wp14:editId="654EA945">
-            <wp:extent cx="3935698" cy="1394086"/>
-            <wp:effectExtent l="0" t="0" r="1905" b="3175"/>
-            <wp:docPr id="7101693" name="Imagen 2"/>
+          <wp:inline distT="0" distB="0" distL="0" distR="0" wp14:anchorId="69BE5927" wp14:editId="517D92CD">
+            <wp:extent cx="4107305" cy="1913890"/>
+            <wp:effectExtent l="0" t="0" r="0" b="3810"/>
+            <wp:docPr id="922683533" name="Imagen 1"/>
             <wp:cNvGraphicFramePr>
               <a:graphicFrameLocks xmlns:a="http://schemas.openxmlformats.org/drawingml/2006/main" noChangeAspect="1"/>
             </wp:cNvGraphicFramePr>
@@ -823,7 +823,7 @@
               <a:graphicData uri="http://schemas.openxmlformats.org/drawingml/2006/picture">
                 <pic:pic xmlns:pic="http://schemas.openxmlformats.org/drawingml/2006/picture">
                   <pic:nvPicPr>
-                    <pic:cNvPr id="7101693" name="Imagen 7101693"/>
+                    <pic:cNvPr id="922683533" name="Imagen 922683533"/>
                     <pic:cNvPicPr/>
                   </pic:nvPicPr>
                   <pic:blipFill rotWithShape="1">
@@ -834,7 +834,7 @@
                         </a:ext>
                       </a:extLst>
                     </a:blip>
-                    <a:srcRect l="23372" r="23463" b="53819"/>
+                    <a:srcRect l="16827" t="3143" r="16099" b="35583"/>
                     <a:stretch>
                       <a:fillRect/>
                     </a:stretch>
@@ -842,7 +842,7 @@
                   <pic:spPr bwMode="auto">
                     <a:xfrm>
                       <a:off x="0" y="0"/>
-                      <a:ext cx="3984666" cy="1411431"/>
+                      <a:ext cx="4133212" cy="1925962"/>
                     </a:xfrm>
                     <a:prstGeom prst="rect">
                       <a:avLst/>
@@ -881,7 +881,27 @@
           <w:sz w:val="21"/>
           <w:szCs w:val="21"/>
         </w:rPr>
-        <w:t>Tabla 2. Resumen Modelo Ventas – Gasto Publicidad</w:t>
+        <w:t>Tabla 2. Resumen Modelo</w:t>
+      </w:r>
+      <w:r>
+        <w:rPr>
+          <w:rFonts w:ascii="Times New Roman" w:hAnsi="Times New Roman" w:cs="Times New Roman"/>
+          <w:i/>
+          <w:iCs/>
+          <w:sz w:val="21"/>
+          <w:szCs w:val="21"/>
+        </w:rPr>
+        <w:t xml:space="preserve"> 1</w:t>
+      </w:r>
+      <w:r>
+        <w:rPr>
+          <w:rFonts w:ascii="Times New Roman" w:hAnsi="Times New Roman" w:cs="Times New Roman"/>
+          <w:i/>
+          <w:iCs/>
+          <w:sz w:val="21"/>
+          <w:szCs w:val="21"/>
+        </w:rPr>
+        <w:t xml:space="preserve"> Ventas – Gasto Publicidad</w:t>
       </w:r>
     </w:p>
     <w:p>
@@ -944,13 +964,7 @@
         <w:rPr>
           <w:rFonts w:ascii="Times New Roman" w:hAnsi="Times New Roman" w:cs="Times New Roman"/>
         </w:rPr>
-        <w:t xml:space="preserve"> (~7.47</w:t>
-      </w:r>
-      <w:r>
-        <w:rPr>
-          <w:rFonts w:ascii="Times New Roman" w:hAnsi="Times New Roman" w:cs="Times New Roman"/>
-        </w:rPr>
-        <w:t xml:space="preserve">). </w:t>
+        <w:t xml:space="preserve"> (~7.47). </w:t>
       </w:r>
       <w:r>
         <w:rPr>
@@ -984,19 +998,7 @@
         <w:rPr>
           <w:rFonts w:ascii="Times New Roman" w:hAnsi="Times New Roman" w:cs="Times New Roman"/>
         </w:rPr>
-        <w:t>El coeficiente de Gasto</w:t>
-      </w:r>
-      <w:r>
-        <w:rPr>
-          <w:rFonts w:ascii="Times New Roman" w:hAnsi="Times New Roman" w:cs="Times New Roman"/>
-        </w:rPr>
-        <w:t xml:space="preserve"> </w:t>
-      </w:r>
-      <w:r>
-        <w:rPr>
-          <w:rFonts w:ascii="Times New Roman" w:hAnsi="Times New Roman" w:cs="Times New Roman"/>
-        </w:rPr>
-        <w:t>Publicidad es estadísticamente significativo (p &lt; 0.001, indicado con ***), lo que significa que existe evidencia sólida de que la publicidad influye en las ventas. Sin embargo, el R² = 0.1237 muestra que el modelo solo explica alrededor del 12.37% de la variación en las ventas. Esto implica que, aunque la relación es real y significativa, hay muchos otros factores no incluidos en el modelo que también afectan las ventas, por lo que el modelo es válido pero limitado en su capacidad explicativa.</w:t>
+        <w:t>El coeficiente de Gasto Publicidad es estadísticamente significativo (p &lt; 0.001, indicado con ***), lo que significa que existe evidencia sólida de que la publicidad influye en las ventas. Sin embargo, el R² = 0.1237 muestra que el modelo solo explica alrededor del 12.37% de la variación en las ventas. Esto implica que, aunque la relación es real y significativa, hay muchos otros factores no incluidos en el modelo que también afectan las ventas, por lo que el modelo es válido pero limitado en su capacidad explicativa.</w:t>
       </w:r>
     </w:p>
     <w:p>
@@ -1006,6 +1008,232 @@
           <w:rFonts w:ascii="Times New Roman" w:hAnsi="Times New Roman" w:cs="Times New Roman"/>
           <w:b/>
           <w:bCs/>
+        </w:rPr>
+      </w:pPr>
+    </w:p>
+    <w:p>
+      <w:pPr>
+        <w:jc w:val="both"/>
+        <w:rPr>
+          <w:rFonts w:ascii="Times New Roman" w:hAnsi="Times New Roman" w:cs="Times New Roman"/>
+          <w:b/>
+          <w:bCs/>
+        </w:rPr>
+      </w:pPr>
+      <w:r>
+        <w:rPr>
+          <w:rFonts w:ascii="Times New Roman" w:hAnsi="Times New Roman" w:cs="Times New Roman"/>
+          <w:b/>
+          <w:bCs/>
+        </w:rPr>
+        <w:lastRenderedPageBreak/>
+        <w:t>Punto 3</w:t>
+      </w:r>
+    </w:p>
+    <w:p>
+      <w:pPr>
+        <w:jc w:val="both"/>
+        <w:rPr>
+          <w:rFonts w:ascii="Times New Roman" w:hAnsi="Times New Roman" w:cs="Times New Roman"/>
+          <w:b/>
+          <w:bCs/>
+        </w:rPr>
+      </w:pPr>
+    </w:p>
+    <w:p>
+      <w:pPr>
+        <w:jc w:val="both"/>
+        <w:rPr>
+          <w:rFonts w:ascii="Times New Roman" w:hAnsi="Times New Roman" w:cs="Times New Roman"/>
+          <w:b/>
+          <w:bCs/>
+        </w:rPr>
+      </w:pPr>
+      <w:r>
+        <w:rPr>
+          <w:rFonts w:ascii="Times New Roman" w:hAnsi="Times New Roman" w:cs="Times New Roman"/>
+          <w:b/>
+          <w:bCs/>
+          <w:noProof/>
+          <w14:ligatures w14:val="standardContextual"/>
+        </w:rPr>
+        <w:drawing>
+          <wp:inline distT="0" distB="0" distL="0" distR="0" wp14:anchorId="36757614" wp14:editId="14C975E7">
+            <wp:extent cx="3844977" cy="2011077"/>
+            <wp:effectExtent l="0" t="0" r="3175" b="0"/>
+            <wp:docPr id="1787275315" name="Imagen 2"/>
+            <wp:cNvGraphicFramePr>
+              <a:graphicFrameLocks xmlns:a="http://schemas.openxmlformats.org/drawingml/2006/main" noChangeAspect="1"/>
+            </wp:cNvGraphicFramePr>
+            <a:graphic xmlns:a="http://schemas.openxmlformats.org/drawingml/2006/main">
+              <a:graphicData uri="http://schemas.openxmlformats.org/drawingml/2006/picture">
+                <pic:pic xmlns:pic="http://schemas.openxmlformats.org/drawingml/2006/picture">
+                  <pic:nvPicPr>
+                    <pic:cNvPr id="1787275315" name="Imagen 1787275315"/>
+                    <pic:cNvPicPr/>
+                  </pic:nvPicPr>
+                  <pic:blipFill rotWithShape="1">
+                    <a:blip r:embed="rId8" cstate="print">
+                      <a:extLst>
+                        <a:ext uri="{28A0092B-C50C-407E-A947-70E740481C1C}">
+                          <a14:useLocalDpi xmlns:a14="http://schemas.microsoft.com/office/drawing/2010/main" val="0"/>
+                        </a:ext>
+                      </a:extLst>
+                    </a:blip>
+                    <a:srcRect l="19499" t="3241" r="19195" b="26015"/>
+                    <a:stretch>
+                      <a:fillRect/>
+                    </a:stretch>
+                  </pic:blipFill>
+                  <pic:spPr bwMode="auto">
+                    <a:xfrm>
+                      <a:off x="0" y="0"/>
+                      <a:ext cx="3857003" cy="2017367"/>
+                    </a:xfrm>
+                    <a:prstGeom prst="rect">
+                      <a:avLst/>
+                    </a:prstGeom>
+                    <a:ln>
+                      <a:noFill/>
+                    </a:ln>
+                    <a:extLst>
+                      <a:ext uri="{53640926-AAD7-44D8-BBD7-CCE9431645EC}">
+                        <a14:shadowObscured xmlns:a14="http://schemas.microsoft.com/office/drawing/2010/main"/>
+                      </a:ext>
+                    </a:extLst>
+                  </pic:spPr>
+                </pic:pic>
+              </a:graphicData>
+            </a:graphic>
+          </wp:inline>
+        </w:drawing>
+      </w:r>
+    </w:p>
+    <w:p>
+      <w:pPr>
+        <w:jc w:val="both"/>
+        <w:rPr>
+          <w:rFonts w:ascii="Times New Roman" w:hAnsi="Times New Roman" w:cs="Times New Roman"/>
+          <w:i/>
+          <w:iCs/>
+          <w:sz w:val="21"/>
+          <w:szCs w:val="21"/>
+        </w:rPr>
+      </w:pPr>
+      <w:r>
+        <w:rPr>
+          <w:rFonts w:ascii="Times New Roman" w:hAnsi="Times New Roman" w:cs="Times New Roman"/>
+          <w:i/>
+          <w:iCs/>
+          <w:sz w:val="21"/>
+          <w:szCs w:val="21"/>
+        </w:rPr>
+        <w:t>Tabla</w:t>
+      </w:r>
+      <w:r>
+        <w:rPr>
+          <w:rFonts w:ascii="Times New Roman" w:hAnsi="Times New Roman" w:cs="Times New Roman"/>
+          <w:i/>
+          <w:iCs/>
+          <w:sz w:val="21"/>
+          <w:szCs w:val="21"/>
+        </w:rPr>
+        <w:t xml:space="preserve"> 3</w:t>
+      </w:r>
+      <w:r>
+        <w:rPr>
+          <w:rFonts w:ascii="Times New Roman" w:hAnsi="Times New Roman" w:cs="Times New Roman"/>
+          <w:i/>
+          <w:iCs/>
+          <w:sz w:val="21"/>
+          <w:szCs w:val="21"/>
+        </w:rPr>
+        <w:t>. Resumen Modelo</w:t>
+      </w:r>
+      <w:r>
+        <w:rPr>
+          <w:rFonts w:ascii="Times New Roman" w:hAnsi="Times New Roman" w:cs="Times New Roman"/>
+          <w:i/>
+          <w:iCs/>
+          <w:sz w:val="21"/>
+          <w:szCs w:val="21"/>
+        </w:rPr>
+        <w:t xml:space="preserve"> </w:t>
+      </w:r>
+      <w:r>
+        <w:rPr>
+          <w:rFonts w:ascii="Times New Roman" w:hAnsi="Times New Roman" w:cs="Times New Roman"/>
+          <w:i/>
+          <w:iCs/>
+          <w:sz w:val="21"/>
+          <w:szCs w:val="21"/>
+        </w:rPr>
+        <w:t>2</w:t>
+      </w:r>
+      <w:r>
+        <w:rPr>
+          <w:rFonts w:ascii="Times New Roman" w:hAnsi="Times New Roman" w:cs="Times New Roman"/>
+          <w:i/>
+          <w:iCs/>
+          <w:sz w:val="21"/>
+          <w:szCs w:val="21"/>
+        </w:rPr>
+        <w:t xml:space="preserve"> Ventas – Gasto Publicidad</w:t>
+      </w:r>
+      <w:r>
+        <w:rPr>
+          <w:rFonts w:ascii="Times New Roman" w:hAnsi="Times New Roman" w:cs="Times New Roman"/>
+          <w:i/>
+          <w:iCs/>
+          <w:sz w:val="21"/>
+          <w:szCs w:val="21"/>
+        </w:rPr>
+        <w:t xml:space="preserve"> + </w:t>
+      </w:r>
+      <w:proofErr w:type="spellStart"/>
+      <w:r>
+        <w:rPr>
+          <w:rFonts w:ascii="Times New Roman" w:hAnsi="Times New Roman" w:cs="Times New Roman"/>
+          <w:i/>
+          <w:iCs/>
+          <w:sz w:val="21"/>
+          <w:szCs w:val="21"/>
+        </w:rPr>
+        <w:t>Holliday</w:t>
+      </w:r>
+      <w:proofErr w:type="spellEnd"/>
+      <w:r>
+        <w:rPr>
+          <w:rFonts w:ascii="Times New Roman" w:hAnsi="Times New Roman" w:cs="Times New Roman"/>
+          <w:i/>
+          <w:iCs/>
+          <w:sz w:val="21"/>
+          <w:szCs w:val="21"/>
+        </w:rPr>
+        <w:t xml:space="preserve"> </w:t>
+      </w:r>
+      <w:proofErr w:type="spellStart"/>
+      <w:r>
+        <w:rPr>
+          <w:rFonts w:ascii="Times New Roman" w:hAnsi="Times New Roman" w:cs="Times New Roman"/>
+          <w:i/>
+          <w:iCs/>
+          <w:sz w:val="21"/>
+          <w:szCs w:val="21"/>
+        </w:rPr>
+        <w:t>Season</w:t>
+      </w:r>
+      <w:proofErr w:type="spellEnd"/>
+    </w:p>
+    <w:p>
+      <w:pPr>
+        <w:jc w:val="both"/>
+        <w:rPr>
+          <w:rFonts w:ascii="Times New Roman" w:hAnsi="Times New Roman" w:cs="Times New Roman"/>
+          <w:i/>
+          <w:iCs/>
+          <w:sz w:val="21"/>
+          <w:szCs w:val="21"/>
         </w:rPr>
       </w:pPr>
     </w:p>

</xml_diff>

<commit_message>
Analisis punto 5 y 7 en word
</commit_message>
<xml_diff>
--- a/Tours_Marketing_Caso3.docx
+++ b/Tours_Marketing_Caso3.docx
@@ -672,7 +672,7 @@
           <w14:ligatures w14:val="standardContextual"/>
         </w:rPr>
         <w:drawing>
-          <wp:inline distT="0" distB="0" distL="0" distR="0" wp14:anchorId="63808AB8" wp14:editId="14E20F9A">
+          <wp:inline distT="0" distB="0" distL="0" distR="0" wp14:anchorId="63808AB8" wp14:editId="2E2E1FB0">
             <wp:extent cx="4746517" cy="2278504"/>
             <wp:effectExtent l="0" t="0" r="3810" b="0"/>
             <wp:docPr id="598485339" name="Imagen 1"/>
@@ -739,19 +739,8 @@
           <w:sz w:val="21"/>
           <w:szCs w:val="21"/>
         </w:rPr>
-        <w:t xml:space="preserve">Tabla 1. Resumen Estadístico variables </w:t>
-      </w:r>
-      <w:proofErr w:type="spellStart"/>
-      <w:r>
-        <w:rPr>
-          <w:i/>
-          <w:iCs/>
-          <w:sz w:val="21"/>
-          <w:szCs w:val="21"/>
-        </w:rPr>
-        <w:t>Opry</w:t>
-      </w:r>
-      <w:proofErr w:type="spellEnd"/>
+        <w:t>Tabla 1. Resumen Estadístico variables Opry</w:t>
+      </w:r>
     </w:p>
     <w:p>
       <w:pPr>
@@ -792,7 +781,7 @@
           <w14:ligatures w14:val="standardContextual"/>
         </w:rPr>
         <w:drawing>
-          <wp:inline distT="0" distB="0" distL="0" distR="0" wp14:anchorId="00642F71" wp14:editId="727BDD34">
+          <wp:inline distT="0" distB="0" distL="0" distR="0" wp14:anchorId="00642F71" wp14:editId="4DEA3CDF">
             <wp:extent cx="3790592" cy="3028013"/>
             <wp:effectExtent l="0" t="0" r="0" b="0"/>
             <wp:docPr id="1004071572" name="Imagen 4"/>
@@ -910,7 +899,7 @@
         </w:rPr>
         <w:lastRenderedPageBreak/>
         <w:drawing>
-          <wp:inline distT="0" distB="0" distL="0" distR="0" wp14:anchorId="5CAAF6A8" wp14:editId="2DCB7CB4">
+          <wp:inline distT="0" distB="0" distL="0" distR="0" wp14:anchorId="5CAAF6A8" wp14:editId="7687AC4F">
             <wp:extent cx="4210872" cy="2870616"/>
             <wp:effectExtent l="0" t="0" r="5715" b="0"/>
             <wp:docPr id="759667428" name="Imagen 5"/>
@@ -1038,7 +1027,7 @@
           <w14:ligatures w14:val="standardContextual"/>
         </w:rPr>
         <w:drawing>
-          <wp:inline distT="0" distB="0" distL="0" distR="0" wp14:anchorId="69BE5927" wp14:editId="517D92CD">
+          <wp:inline distT="0" distB="0" distL="0" distR="0" wp14:anchorId="69BE5927" wp14:editId="6247C61A">
             <wp:extent cx="4107305" cy="1913890"/>
             <wp:effectExtent l="0" t="0" r="0" b="3810"/>
             <wp:docPr id="922683533" name="Imagen 1"/>
@@ -1159,15 +1148,7 @@
         <w:jc w:val="both"/>
       </w:pPr>
       <w:r>
-        <w:t xml:space="preserve">Coeficiente </w:t>
-      </w:r>
-      <w:proofErr w:type="spellStart"/>
-      <w:r>
-        <w:t>Gasto_Publicidad</w:t>
-      </w:r>
-      <w:proofErr w:type="spellEnd"/>
-      <w:r>
-        <w:t xml:space="preserve"> (~7.47). </w:t>
+        <w:t xml:space="preserve">Coeficiente Gasto_Publicidad (~7.47). </w:t>
       </w:r>
       <w:r>
         <w:t xml:space="preserve">Es decir, </w:t>
@@ -1347,7 +1328,7 @@
           <w:sz w:val="21"/>
           <w:szCs w:val="21"/>
         </w:rPr>
-        <w:t xml:space="preserve"> </w:t>
+        <w:t xml:space="preserve"> 2</w:t>
       </w:r>
       <w:r>
         <w:rPr>
@@ -1356,7 +1337,7 @@
           <w:sz w:val="21"/>
           <w:szCs w:val="21"/>
         </w:rPr>
-        <w:t>2</w:t>
+        <w:t xml:space="preserve"> Ventas – Gasto Publicidad</w:t>
       </w:r>
       <w:r>
         <w:rPr>
@@ -1365,48 +1346,8 @@
           <w:sz w:val="21"/>
           <w:szCs w:val="21"/>
         </w:rPr>
-        <w:t xml:space="preserve"> Ventas – Gasto Publicidad</w:t>
-      </w:r>
-      <w:r>
-        <w:rPr>
-          <w:i/>
-          <w:iCs/>
-          <w:sz w:val="21"/>
-          <w:szCs w:val="21"/>
-        </w:rPr>
-        <w:t xml:space="preserve"> + </w:t>
-      </w:r>
-      <w:proofErr w:type="spellStart"/>
-      <w:r>
-        <w:rPr>
-          <w:i/>
-          <w:iCs/>
-          <w:sz w:val="21"/>
-          <w:szCs w:val="21"/>
-        </w:rPr>
-        <w:t>Holliday</w:t>
-      </w:r>
-      <w:proofErr w:type="spellEnd"/>
-      <w:r>
-        <w:rPr>
-          <w:i/>
-          <w:iCs/>
-          <w:sz w:val="21"/>
-          <w:szCs w:val="21"/>
-        </w:rPr>
-        <w:t xml:space="preserve"> </w:t>
-      </w:r>
-      <w:proofErr w:type="spellStart"/>
-      <w:r>
-        <w:rPr>
-          <w:i/>
-          <w:iCs/>
-          <w:sz w:val="21"/>
-          <w:szCs w:val="21"/>
-        </w:rPr>
-        <w:t>Season</w:t>
-      </w:r>
-      <w:proofErr w:type="spellEnd"/>
+        <w:t xml:space="preserve"> + Holliday Season</w:t>
+      </w:r>
     </w:p>
     <w:p>
       <w:pPr>
@@ -1431,24 +1372,14 @@
       <w:r>
         <w:t>Al incluir la variable de estacionalidad (</w:t>
       </w:r>
-      <w:proofErr w:type="spellStart"/>
       <w:r>
         <w:rPr>
           <w:rStyle w:val="nfasis"/>
         </w:rPr>
         <w:t>Holliday_seasson</w:t>
       </w:r>
-      <w:proofErr w:type="spellEnd"/>
-      <w:r>
-        <w:t xml:space="preserve">), el coeficiente de </w:t>
-      </w:r>
-      <w:proofErr w:type="spellStart"/>
-      <w:r>
-        <w:t>Gasto_Publicidad</w:t>
-      </w:r>
-      <w:proofErr w:type="spellEnd"/>
-      <w:r>
-        <w:t xml:space="preserve"> disminuye (de ~6.76 en el modelo anterior a ~3.55). Esto ocurre porque ahora el modelo separa el efecto de la estacionalidad sobre las ventas. En el modelo simple, parte del efecto que parecía provenir de la publicidad en realidad estaba capturando variaciones estacionales. Al controlar por este factor, el impacto “puro” de la publicidad sobre las ventas es menor, pero más preciso. </w:t>
+      <w:r>
+        <w:t xml:space="preserve">), el coeficiente de Gasto_Publicidad disminuye (de ~6.76 en el modelo anterior a ~3.55). Esto ocurre porque ahora el modelo separa el efecto de la estacionalidad sobre las ventas. En el modelo simple, parte del efecto que parecía provenir de la publicidad en realidad estaba capturando variaciones estacionales. Al controlar por este factor, el impacto “puro” de la publicidad sobre las ventas es menor, pero más preciso. </w:t>
       </w:r>
     </w:p>
     <w:p>
@@ -1462,37 +1393,11 @@
       </w:pPr>
       <w:r>
         <w:rPr>
-          <w:rStyle w:val="Fuerte"/>
+          <w:rStyle w:val="Textoennegrita"/>
           <w:b w:val="0"/>
           <w:bCs w:val="0"/>
         </w:rPr>
-        <w:t xml:space="preserve">Coeficiente de </w:t>
-      </w:r>
-      <w:proofErr w:type="spellStart"/>
-      <w:r>
-        <w:rPr>
-          <w:rStyle w:val="Fuerte"/>
-          <w:b w:val="0"/>
-          <w:bCs w:val="0"/>
-        </w:rPr>
-        <w:t>Holliday_seasson</w:t>
-      </w:r>
-      <w:proofErr w:type="spellEnd"/>
-      <w:r>
-        <w:rPr>
-          <w:rStyle w:val="Fuerte"/>
-          <w:b w:val="0"/>
-          <w:bCs w:val="0"/>
-        </w:rPr>
-        <w:t xml:space="preserve"> (~−$605,446)</w:t>
-      </w:r>
-      <w:r>
-        <w:rPr>
-          <w:rStyle w:val="Fuerte"/>
-          <w:b w:val="0"/>
-          <w:bCs w:val="0"/>
-        </w:rPr>
-        <w:t>. Este indica</w:t>
+        <w:t>Coeficiente de Holliday_seasson (~−$605,446). Este indica</w:t>
       </w:r>
       <w:r>
         <w:t xml:space="preserve"> que, durante las semanas de baja estacionalidad (como finales de diciembre y enero), las ventas disminuyen en promedio en aproximadamente $605,446 en comparación con semanas normales, manteniendo constante el gasto en publicidad. Este efecto es altamente significativo (p &lt; 0.001), lo que confirma que la estacionalidad tiene un impacto fuerte y sistemático sobre las ventas.</w:t>
@@ -1654,7 +1559,7 @@
           <w14:ligatures w14:val="standardContextual"/>
         </w:rPr>
         <w:drawing>
-          <wp:inline distT="0" distB="0" distL="0" distR="0" wp14:anchorId="6B446352" wp14:editId="32464775">
+          <wp:inline distT="0" distB="0" distL="0" distR="0" wp14:anchorId="6B446352" wp14:editId="18F74CBE">
             <wp:extent cx="4353231" cy="2181069"/>
             <wp:effectExtent l="0" t="0" r="3175" b="3810"/>
             <wp:docPr id="1254377075" name="Imagen 3"/>
@@ -1731,7 +1636,7 @@
           <w:sz w:val="21"/>
           <w:szCs w:val="21"/>
         </w:rPr>
-        <w:t xml:space="preserve"> </w:t>
+        <w:t xml:space="preserve"> 4</w:t>
       </w:r>
       <w:r>
         <w:rPr>
@@ -1740,7 +1645,7 @@
           <w:sz w:val="21"/>
           <w:szCs w:val="21"/>
         </w:rPr>
-        <w:t>4</w:t>
+        <w:t>. Resumen Modelo</w:t>
       </w:r>
       <w:r>
         <w:rPr>
@@ -1749,7 +1654,7 @@
           <w:sz w:val="21"/>
           <w:szCs w:val="21"/>
         </w:rPr>
-        <w:t>. Resumen Modelo</w:t>
+        <w:t xml:space="preserve"> 3</w:t>
       </w:r>
       <w:r>
         <w:rPr>
@@ -1767,7 +1672,7 @@
           <w:sz w:val="21"/>
           <w:szCs w:val="21"/>
         </w:rPr>
-        <w:t>3</w:t>
+        <w:t xml:space="preserve">Log </w:t>
       </w:r>
       <w:r>
         <w:rPr>
@@ -1776,7 +1681,7 @@
           <w:sz w:val="21"/>
           <w:szCs w:val="21"/>
         </w:rPr>
-        <w:t xml:space="preserve"> </w:t>
+        <w:t>Ventas – Gasto Publicidad</w:t>
       </w:r>
       <w:r>
         <w:rPr>
@@ -1785,57 +1690,8 @@
           <w:sz w:val="21"/>
           <w:szCs w:val="21"/>
         </w:rPr>
-        <w:t xml:space="preserve">Log </w:t>
-      </w:r>
-      <w:r>
-        <w:rPr>
-          <w:i/>
-          <w:iCs/>
-          <w:sz w:val="21"/>
-          <w:szCs w:val="21"/>
-        </w:rPr>
-        <w:t>Ventas – Gasto Publicidad</w:t>
-      </w:r>
-      <w:r>
-        <w:rPr>
-          <w:i/>
-          <w:iCs/>
-          <w:sz w:val="21"/>
-          <w:szCs w:val="21"/>
-        </w:rPr>
-        <w:t xml:space="preserve"> + </w:t>
-      </w:r>
-      <w:proofErr w:type="spellStart"/>
-      <w:r>
-        <w:rPr>
-          <w:i/>
-          <w:iCs/>
-          <w:sz w:val="21"/>
-          <w:szCs w:val="21"/>
-        </w:rPr>
-        <w:t>Holliday</w:t>
-      </w:r>
-      <w:proofErr w:type="spellEnd"/>
-      <w:r>
-        <w:rPr>
-          <w:i/>
-          <w:iCs/>
-          <w:sz w:val="21"/>
-          <w:szCs w:val="21"/>
-        </w:rPr>
-        <w:t xml:space="preserve"> </w:t>
-      </w:r>
-      <w:proofErr w:type="spellStart"/>
-      <w:r>
-        <w:rPr>
-          <w:i/>
-          <w:iCs/>
-          <w:sz w:val="21"/>
-          <w:szCs w:val="21"/>
-        </w:rPr>
-        <w:t>Season</w:t>
-      </w:r>
-      <w:proofErr w:type="spellEnd"/>
+        <w:t xml:space="preserve"> + Holliday Season</w:t>
+      </w:r>
     </w:p>
     <w:p>
       <w:pPr>
@@ -1872,7 +1728,7 @@
       </w:r>
       <w:r>
         <w:rPr>
-          <w:rStyle w:val="Fuerte"/>
+          <w:rStyle w:val="Textoennegrita"/>
           <w:b w:val="0"/>
           <w:bCs w:val="0"/>
         </w:rPr>
@@ -1900,47 +1756,20 @@
       </w:pPr>
       <w:r>
         <w:rPr>
-          <w:rStyle w:val="Fuerte"/>
+          <w:rStyle w:val="Textoennegrita"/>
           <w:b w:val="0"/>
           <w:bCs w:val="0"/>
         </w:rPr>
-        <w:t>I</w:t>
-      </w:r>
-      <w:r>
-        <w:rPr>
-          <w:rStyle w:val="Fuerte"/>
-          <w:b w:val="0"/>
-          <w:bCs w:val="0"/>
-        </w:rPr>
-        <w:t>ntercepto (~13.82)</w:t>
-      </w:r>
-      <w:r>
-        <w:rPr>
-          <w:rStyle w:val="Fuerte"/>
-          <w:b w:val="0"/>
-          <w:bCs w:val="0"/>
-        </w:rPr>
-        <w:t>. Este</w:t>
-      </w:r>
-      <w:r>
-        <w:rPr>
-          <w:rStyle w:val="Fuerte"/>
+        <w:t>Intercepto (~13.82). Este</w:t>
+      </w:r>
+      <w:r>
+        <w:rPr>
+          <w:rStyle w:val="Textoennegrita"/>
         </w:rPr>
         <w:t xml:space="preserve"> </w:t>
       </w:r>
       <w:r>
-        <w:t>representa el logaritmo natural de las ventas esperadas cuando el gasto en publicidad es 0 y no hay efecto de estacionalidad (</w:t>
-      </w:r>
-      <w:proofErr w:type="spellStart"/>
-      <w:r>
-        <w:t>Holliday_seasson</w:t>
-      </w:r>
-      <w:proofErr w:type="spellEnd"/>
-      <w:r>
-        <w:t xml:space="preserve"> = 0). Para interpretarlo en términos de ventas reales, se debe aplicar la función exponencial: Ventas base ≈ e^(13.82)</w:t>
-      </w:r>
-      <w:r>
-        <w:t xml:space="preserve">. </w:t>
+        <w:t xml:space="preserve">representa el logaritmo natural de las ventas esperadas cuando el gasto en publicidad es 0 y no hay efecto de estacionalidad (Holliday_seasson = 0). Para interpretarlo en términos de ventas reales, se debe aplicar la función exponencial: Ventas base ≈ e^(13.82). </w:t>
       </w:r>
     </w:p>
     <w:p>
@@ -1952,6 +1781,3297 @@
       <w:r>
         <w:t>Esto corresponde al nivel estimado de ventas en condiciones “normales” sin publicidad ni efectos estacionales. Aunque su interpretación directa no siempre es intuitiva, sirve como punto de referencia del modelo.</w:t>
       </w:r>
+    </w:p>
+    <w:p>
+      <w:pPr>
+        <w:spacing w:before="100" w:beforeAutospacing="1" w:after="100" w:afterAutospacing="1"/>
+        <w:jc w:val="both"/>
+        <w:rPr>
+          <w:b/>
+          <w:bCs/>
+        </w:rPr>
+      </w:pPr>
+      <w:r>
+        <w:rPr>
+          <w:b/>
+          <w:bCs/>
+        </w:rPr>
+        <w:t>Punto 5</w:t>
+      </w:r>
+    </w:p>
+    <w:p>
+      <w:pPr>
+        <w:pStyle w:val="TableCaption"/>
+        <w:keepNext/>
+        <w:pBdr>
+          <w:top w:val="none" w:sz="0" w:space="0" w:color="000000"/>
+          <w:left w:val="none" w:sz="0" w:space="0" w:color="000000"/>
+          <w:bottom w:val="none" w:sz="0" w:space="0" w:color="000000"/>
+          <w:right w:val="none" w:sz="0" w:space="0" w:color="000000"/>
+        </w:pBdr>
+        <w:spacing w:before="60" w:after="60"/>
+        <w:ind w:left="60" w:right="60"/>
+        <w:rPr>
+          <w:rFonts w:ascii="Times New Roman" w:hAnsi="Times New Roman" w:cs="Times New Roman"/>
+          <w:lang w:val="es-CO"/>
+        </w:rPr>
+      </w:pPr>
+      <w:r>
+        <w:rPr>
+          <w:rFonts w:ascii="Times New Roman" w:eastAsia="Helvetica" w:hAnsi="Times New Roman" w:cs="Times New Roman"/>
+          <w:i w:val="0"/>
+          <w:color w:val="000000"/>
+          <w:lang w:val="es-CO"/>
+        </w:rPr>
+        <w:t>Modelo 4: Log(Ventas) — Resultados de Regresión</w:t>
+      </w:r>
+    </w:p>
+    <w:tbl>
+      <w:tblPr>
+        <w:tblW w:w="9748" w:type="dxa"/>
+        <w:jc w:val="center"/>
+        <w:tblLayout w:type="fixed"/>
+        <w:tblLook w:val="0420" w:firstRow="1" w:lastRow="0" w:firstColumn="0" w:lastColumn="0" w:noHBand="0" w:noVBand="1"/>
+      </w:tblPr>
+      <w:tblGrid>
+        <w:gridCol w:w="3309"/>
+        <w:gridCol w:w="1596"/>
+        <w:gridCol w:w="1413"/>
+        <w:gridCol w:w="1206"/>
+        <w:gridCol w:w="1144"/>
+        <w:gridCol w:w="1080"/>
+      </w:tblGrid>
+      <w:tr>
+        <w:trPr>
+          <w:tblHeader/>
+          <w:jc w:val="center"/>
+        </w:trPr>
+        <w:tc>
+          <w:tcPr>
+            <w:tcW w:w="3309" w:type="dxa"/>
+            <w:tcBorders>
+              <w:top w:val="single" w:sz="12" w:space="0" w:color="666666"/>
+              <w:left w:val="none" w:sz="0" w:space="0" w:color="000000"/>
+              <w:bottom w:val="single" w:sz="12" w:space="0" w:color="666666"/>
+              <w:right w:val="none" w:sz="0" w:space="0" w:color="000000"/>
+            </w:tcBorders>
+            <w:shd w:val="clear" w:color="auto" w:fill="DEEAF1"/>
+            <w:tcMar>
+              <w:top w:w="0" w:type="dxa"/>
+              <w:left w:w="0" w:type="dxa"/>
+              <w:bottom w:w="0" w:type="dxa"/>
+              <w:right w:w="0" w:type="dxa"/>
+            </w:tcMar>
+            <w:vAlign w:val="center"/>
+          </w:tcPr>
+          <w:p>
+            <w:pPr>
+              <w:pBdr>
+                <w:top w:val="none" w:sz="0" w:space="0" w:color="000000"/>
+                <w:left w:val="none" w:sz="0" w:space="0" w:color="000000"/>
+                <w:bottom w:val="none" w:sz="0" w:space="0" w:color="000000"/>
+                <w:right w:val="none" w:sz="0" w:space="0" w:color="000000"/>
+              </w:pBdr>
+              <w:spacing w:before="100" w:after="100"/>
+              <w:ind w:left="100" w:right="100"/>
+              <w:rPr>
+                <w:rFonts w:eastAsia="Helvetica"/>
+                <w:b/>
+                <w:color w:val="000000"/>
+              </w:rPr>
+            </w:pPr>
+            <w:r>
+              <w:rPr>
+                <w:rFonts w:eastAsia="Helvetica"/>
+                <w:b/>
+                <w:color w:val="000000"/>
+              </w:rPr>
+              <w:t>Variable</w:t>
+            </w:r>
+          </w:p>
+        </w:tc>
+        <w:tc>
+          <w:tcPr>
+            <w:tcW w:w="1596" w:type="dxa"/>
+            <w:tcBorders>
+              <w:top w:val="single" w:sz="12" w:space="0" w:color="666666"/>
+              <w:left w:val="none" w:sz="0" w:space="0" w:color="000000"/>
+              <w:bottom w:val="single" w:sz="12" w:space="0" w:color="666666"/>
+              <w:right w:val="none" w:sz="0" w:space="0" w:color="000000"/>
+            </w:tcBorders>
+            <w:shd w:val="clear" w:color="auto" w:fill="DEEAF1"/>
+            <w:tcMar>
+              <w:top w:w="0" w:type="dxa"/>
+              <w:left w:w="0" w:type="dxa"/>
+              <w:bottom w:w="0" w:type="dxa"/>
+              <w:right w:w="0" w:type="dxa"/>
+            </w:tcMar>
+            <w:vAlign w:val="center"/>
+          </w:tcPr>
+          <w:p>
+            <w:pPr>
+              <w:pBdr>
+                <w:top w:val="none" w:sz="0" w:space="0" w:color="000000"/>
+                <w:left w:val="none" w:sz="0" w:space="0" w:color="000000"/>
+                <w:bottom w:val="none" w:sz="0" w:space="0" w:color="000000"/>
+                <w:right w:val="none" w:sz="0" w:space="0" w:color="000000"/>
+              </w:pBdr>
+              <w:spacing w:before="100" w:after="100"/>
+              <w:ind w:left="100" w:right="100"/>
+              <w:jc w:val="center"/>
+              <w:rPr>
+                <w:rFonts w:eastAsia="Helvetica"/>
+                <w:b/>
+                <w:color w:val="000000"/>
+              </w:rPr>
+            </w:pPr>
+            <w:r>
+              <w:rPr>
+                <w:rFonts w:eastAsia="Helvetica"/>
+                <w:b/>
+                <w:color w:val="000000"/>
+              </w:rPr>
+              <w:t>Coeficiente</w:t>
+            </w:r>
+          </w:p>
+        </w:tc>
+        <w:tc>
+          <w:tcPr>
+            <w:tcW w:w="1413" w:type="dxa"/>
+            <w:tcBorders>
+              <w:top w:val="single" w:sz="12" w:space="0" w:color="666666"/>
+              <w:left w:val="none" w:sz="0" w:space="0" w:color="000000"/>
+              <w:bottom w:val="single" w:sz="12" w:space="0" w:color="666666"/>
+              <w:right w:val="none" w:sz="0" w:space="0" w:color="000000"/>
+            </w:tcBorders>
+            <w:shd w:val="clear" w:color="auto" w:fill="DEEAF1"/>
+            <w:tcMar>
+              <w:top w:w="0" w:type="dxa"/>
+              <w:left w:w="0" w:type="dxa"/>
+              <w:bottom w:w="0" w:type="dxa"/>
+              <w:right w:w="0" w:type="dxa"/>
+            </w:tcMar>
+            <w:vAlign w:val="center"/>
+          </w:tcPr>
+          <w:p>
+            <w:pPr>
+              <w:pBdr>
+                <w:top w:val="none" w:sz="0" w:space="0" w:color="000000"/>
+                <w:left w:val="none" w:sz="0" w:space="0" w:color="000000"/>
+                <w:bottom w:val="none" w:sz="0" w:space="0" w:color="000000"/>
+                <w:right w:val="none" w:sz="0" w:space="0" w:color="000000"/>
+              </w:pBdr>
+              <w:spacing w:before="100" w:after="100"/>
+              <w:ind w:left="100" w:right="100"/>
+              <w:jc w:val="center"/>
+              <w:rPr>
+                <w:rFonts w:eastAsia="Helvetica"/>
+                <w:b/>
+                <w:color w:val="000000"/>
+              </w:rPr>
+            </w:pPr>
+            <w:r>
+              <w:rPr>
+                <w:rFonts w:eastAsia="Helvetica"/>
+                <w:b/>
+                <w:color w:val="000000"/>
+              </w:rPr>
+              <w:t>Error Est.</w:t>
+            </w:r>
+          </w:p>
+        </w:tc>
+        <w:tc>
+          <w:tcPr>
+            <w:tcW w:w="1206" w:type="dxa"/>
+            <w:tcBorders>
+              <w:top w:val="single" w:sz="12" w:space="0" w:color="666666"/>
+              <w:left w:val="none" w:sz="0" w:space="0" w:color="000000"/>
+              <w:bottom w:val="single" w:sz="12" w:space="0" w:color="666666"/>
+              <w:right w:val="none" w:sz="0" w:space="0" w:color="000000"/>
+            </w:tcBorders>
+            <w:shd w:val="clear" w:color="auto" w:fill="DEEAF1"/>
+            <w:tcMar>
+              <w:top w:w="0" w:type="dxa"/>
+              <w:left w:w="0" w:type="dxa"/>
+              <w:bottom w:w="0" w:type="dxa"/>
+              <w:right w:w="0" w:type="dxa"/>
+            </w:tcMar>
+            <w:vAlign w:val="center"/>
+          </w:tcPr>
+          <w:p>
+            <w:pPr>
+              <w:pBdr>
+                <w:top w:val="none" w:sz="0" w:space="0" w:color="000000"/>
+                <w:left w:val="none" w:sz="0" w:space="0" w:color="000000"/>
+                <w:bottom w:val="none" w:sz="0" w:space="0" w:color="000000"/>
+                <w:right w:val="none" w:sz="0" w:space="0" w:color="000000"/>
+              </w:pBdr>
+              <w:spacing w:before="100" w:after="100"/>
+              <w:ind w:left="100" w:right="100"/>
+              <w:jc w:val="center"/>
+              <w:rPr>
+                <w:rFonts w:eastAsia="Helvetica"/>
+                <w:b/>
+                <w:color w:val="000000"/>
+              </w:rPr>
+            </w:pPr>
+            <w:r>
+              <w:rPr>
+                <w:rFonts w:eastAsia="Helvetica"/>
+                <w:b/>
+                <w:color w:val="000000"/>
+              </w:rPr>
+              <w:t>t</w:t>
+            </w:r>
+          </w:p>
+        </w:tc>
+        <w:tc>
+          <w:tcPr>
+            <w:tcW w:w="1144" w:type="dxa"/>
+            <w:tcBorders>
+              <w:top w:val="single" w:sz="12" w:space="0" w:color="666666"/>
+              <w:left w:val="none" w:sz="0" w:space="0" w:color="000000"/>
+              <w:bottom w:val="single" w:sz="12" w:space="0" w:color="666666"/>
+              <w:right w:val="none" w:sz="0" w:space="0" w:color="000000"/>
+            </w:tcBorders>
+            <w:shd w:val="clear" w:color="auto" w:fill="DEEAF1"/>
+            <w:tcMar>
+              <w:top w:w="0" w:type="dxa"/>
+              <w:left w:w="0" w:type="dxa"/>
+              <w:bottom w:w="0" w:type="dxa"/>
+              <w:right w:w="0" w:type="dxa"/>
+            </w:tcMar>
+            <w:vAlign w:val="center"/>
+          </w:tcPr>
+          <w:p>
+            <w:pPr>
+              <w:pBdr>
+                <w:top w:val="none" w:sz="0" w:space="0" w:color="000000"/>
+                <w:left w:val="none" w:sz="0" w:space="0" w:color="000000"/>
+                <w:bottom w:val="none" w:sz="0" w:space="0" w:color="000000"/>
+                <w:right w:val="none" w:sz="0" w:space="0" w:color="000000"/>
+              </w:pBdr>
+              <w:spacing w:before="100" w:after="100"/>
+              <w:ind w:left="100" w:right="100"/>
+              <w:jc w:val="center"/>
+              <w:rPr>
+                <w:rFonts w:eastAsia="Helvetica"/>
+                <w:b/>
+                <w:color w:val="000000"/>
+              </w:rPr>
+            </w:pPr>
+            <w:r>
+              <w:rPr>
+                <w:rFonts w:eastAsia="Helvetica"/>
+                <w:b/>
+                <w:color w:val="000000"/>
+              </w:rPr>
+              <w:t>p-valor</w:t>
+            </w:r>
+          </w:p>
+        </w:tc>
+        <w:tc>
+          <w:tcPr>
+            <w:tcW w:w="1080" w:type="dxa"/>
+            <w:tcBorders>
+              <w:top w:val="single" w:sz="12" w:space="0" w:color="666666"/>
+              <w:left w:val="none" w:sz="0" w:space="0" w:color="000000"/>
+              <w:bottom w:val="single" w:sz="12" w:space="0" w:color="666666"/>
+              <w:right w:val="none" w:sz="0" w:space="0" w:color="000000"/>
+            </w:tcBorders>
+            <w:shd w:val="clear" w:color="auto" w:fill="DEEAF1"/>
+            <w:tcMar>
+              <w:top w:w="0" w:type="dxa"/>
+              <w:left w:w="0" w:type="dxa"/>
+              <w:bottom w:w="0" w:type="dxa"/>
+              <w:right w:w="0" w:type="dxa"/>
+            </w:tcMar>
+            <w:vAlign w:val="center"/>
+          </w:tcPr>
+          <w:p>
+            <w:pPr>
+              <w:pBdr>
+                <w:top w:val="none" w:sz="0" w:space="0" w:color="000000"/>
+                <w:left w:val="none" w:sz="0" w:space="0" w:color="000000"/>
+                <w:bottom w:val="none" w:sz="0" w:space="0" w:color="000000"/>
+                <w:right w:val="none" w:sz="0" w:space="0" w:color="000000"/>
+              </w:pBdr>
+              <w:spacing w:before="100" w:after="100"/>
+              <w:ind w:left="100" w:right="100"/>
+              <w:jc w:val="center"/>
+              <w:rPr>
+                <w:rFonts w:eastAsia="Helvetica"/>
+                <w:b/>
+                <w:color w:val="000000"/>
+              </w:rPr>
+            </w:pPr>
+            <w:r>
+              <w:rPr>
+                <w:rFonts w:eastAsia="Helvetica"/>
+                <w:b/>
+                <w:color w:val="000000"/>
+              </w:rPr>
+              <w:t>Sig.</w:t>
+            </w:r>
+          </w:p>
+        </w:tc>
+      </w:tr>
+      <w:tr>
+        <w:trPr>
+          <w:jc w:val="center"/>
+        </w:trPr>
+        <w:tc>
+          <w:tcPr>
+            <w:tcW w:w="3309" w:type="dxa"/>
+            <w:tcBorders>
+              <w:top w:val="single" w:sz="12" w:space="0" w:color="666666"/>
+              <w:left w:val="none" w:sz="0" w:space="0" w:color="000000"/>
+              <w:bottom w:val="single" w:sz="6" w:space="0" w:color="666666"/>
+              <w:right w:val="none" w:sz="0" w:space="0" w:color="000000"/>
+            </w:tcBorders>
+            <w:shd w:val="clear" w:color="auto" w:fill="FFFFFF"/>
+            <w:tcMar>
+              <w:top w:w="0" w:type="dxa"/>
+              <w:left w:w="0" w:type="dxa"/>
+              <w:bottom w:w="0" w:type="dxa"/>
+              <w:right w:w="0" w:type="dxa"/>
+            </w:tcMar>
+            <w:vAlign w:val="center"/>
+          </w:tcPr>
+          <w:p>
+            <w:pPr>
+              <w:pBdr>
+                <w:top w:val="none" w:sz="0" w:space="0" w:color="000000"/>
+                <w:left w:val="none" w:sz="0" w:space="0" w:color="000000"/>
+                <w:bottom w:val="none" w:sz="0" w:space="0" w:color="000000"/>
+                <w:right w:val="none" w:sz="0" w:space="0" w:color="000000"/>
+              </w:pBdr>
+              <w:spacing w:before="100" w:after="100"/>
+              <w:ind w:left="100" w:right="100"/>
+              <w:rPr>
+                <w:rFonts w:eastAsia="Helvetica"/>
+                <w:color w:val="000000"/>
+              </w:rPr>
+            </w:pPr>
+            <w:r>
+              <w:rPr>
+                <w:rFonts w:eastAsia="Helvetica"/>
+                <w:color w:val="000000"/>
+              </w:rPr>
+              <w:t>(Intercept)</w:t>
+            </w:r>
+          </w:p>
+        </w:tc>
+        <w:tc>
+          <w:tcPr>
+            <w:tcW w:w="1596" w:type="dxa"/>
+            <w:tcBorders>
+              <w:top w:val="single" w:sz="12" w:space="0" w:color="666666"/>
+              <w:left w:val="none" w:sz="0" w:space="0" w:color="000000"/>
+              <w:bottom w:val="single" w:sz="6" w:space="0" w:color="666666"/>
+              <w:right w:val="none" w:sz="0" w:space="0" w:color="000000"/>
+            </w:tcBorders>
+            <w:shd w:val="clear" w:color="auto" w:fill="FFFFFF"/>
+            <w:tcMar>
+              <w:top w:w="0" w:type="dxa"/>
+              <w:left w:w="0" w:type="dxa"/>
+              <w:bottom w:w="0" w:type="dxa"/>
+              <w:right w:w="0" w:type="dxa"/>
+            </w:tcMar>
+            <w:vAlign w:val="center"/>
+          </w:tcPr>
+          <w:p>
+            <w:pPr>
+              <w:pBdr>
+                <w:top w:val="none" w:sz="0" w:space="0" w:color="000000"/>
+                <w:left w:val="none" w:sz="0" w:space="0" w:color="000000"/>
+                <w:bottom w:val="none" w:sz="0" w:space="0" w:color="000000"/>
+                <w:right w:val="none" w:sz="0" w:space="0" w:color="000000"/>
+              </w:pBdr>
+              <w:spacing w:before="100" w:after="100"/>
+              <w:ind w:left="100" w:right="100"/>
+              <w:jc w:val="center"/>
+              <w:rPr>
+                <w:rFonts w:eastAsia="Helvetica"/>
+                <w:color w:val="000000"/>
+              </w:rPr>
+            </w:pPr>
+            <w:r>
+              <w:rPr>
+                <w:rFonts w:eastAsia="Helvetica"/>
+                <w:color w:val="000000"/>
+              </w:rPr>
+              <w:t>13.5852</w:t>
+            </w:r>
+          </w:p>
+        </w:tc>
+        <w:tc>
+          <w:tcPr>
+            <w:tcW w:w="1413" w:type="dxa"/>
+            <w:tcBorders>
+              <w:top w:val="single" w:sz="12" w:space="0" w:color="666666"/>
+              <w:left w:val="none" w:sz="0" w:space="0" w:color="000000"/>
+              <w:bottom w:val="single" w:sz="6" w:space="0" w:color="666666"/>
+              <w:right w:val="none" w:sz="0" w:space="0" w:color="000000"/>
+            </w:tcBorders>
+            <w:shd w:val="clear" w:color="auto" w:fill="FFFFFF"/>
+            <w:tcMar>
+              <w:top w:w="0" w:type="dxa"/>
+              <w:left w:w="0" w:type="dxa"/>
+              <w:bottom w:w="0" w:type="dxa"/>
+              <w:right w:w="0" w:type="dxa"/>
+            </w:tcMar>
+            <w:vAlign w:val="center"/>
+          </w:tcPr>
+          <w:p>
+            <w:pPr>
+              <w:pBdr>
+                <w:top w:val="none" w:sz="0" w:space="0" w:color="000000"/>
+                <w:left w:val="none" w:sz="0" w:space="0" w:color="000000"/>
+                <w:bottom w:val="none" w:sz="0" w:space="0" w:color="000000"/>
+                <w:right w:val="none" w:sz="0" w:space="0" w:color="000000"/>
+              </w:pBdr>
+              <w:spacing w:before="100" w:after="100"/>
+              <w:ind w:left="100" w:right="100"/>
+              <w:jc w:val="center"/>
+              <w:rPr>
+                <w:rFonts w:eastAsia="Helvetica"/>
+                <w:color w:val="000000"/>
+              </w:rPr>
+            </w:pPr>
+            <w:r>
+              <w:rPr>
+                <w:rFonts w:eastAsia="Helvetica"/>
+                <w:color w:val="000000"/>
+              </w:rPr>
+              <w:t>0.3095</w:t>
+            </w:r>
+          </w:p>
+        </w:tc>
+        <w:tc>
+          <w:tcPr>
+            <w:tcW w:w="1206" w:type="dxa"/>
+            <w:tcBorders>
+              <w:top w:val="single" w:sz="12" w:space="0" w:color="666666"/>
+              <w:left w:val="none" w:sz="0" w:space="0" w:color="000000"/>
+              <w:bottom w:val="single" w:sz="6" w:space="0" w:color="666666"/>
+              <w:right w:val="none" w:sz="0" w:space="0" w:color="000000"/>
+            </w:tcBorders>
+            <w:shd w:val="clear" w:color="auto" w:fill="FFFFFF"/>
+            <w:tcMar>
+              <w:top w:w="0" w:type="dxa"/>
+              <w:left w:w="0" w:type="dxa"/>
+              <w:bottom w:w="0" w:type="dxa"/>
+              <w:right w:w="0" w:type="dxa"/>
+            </w:tcMar>
+            <w:vAlign w:val="center"/>
+          </w:tcPr>
+          <w:p>
+            <w:pPr>
+              <w:pBdr>
+                <w:top w:val="none" w:sz="0" w:space="0" w:color="000000"/>
+                <w:left w:val="none" w:sz="0" w:space="0" w:color="000000"/>
+                <w:bottom w:val="none" w:sz="0" w:space="0" w:color="000000"/>
+                <w:right w:val="none" w:sz="0" w:space="0" w:color="000000"/>
+              </w:pBdr>
+              <w:spacing w:before="100" w:after="100"/>
+              <w:ind w:left="100" w:right="100"/>
+              <w:jc w:val="center"/>
+              <w:rPr>
+                <w:rFonts w:eastAsia="Helvetica"/>
+                <w:color w:val="000000"/>
+              </w:rPr>
+            </w:pPr>
+            <w:r>
+              <w:rPr>
+                <w:rFonts w:eastAsia="Helvetica"/>
+                <w:color w:val="000000"/>
+              </w:rPr>
+              <w:t>43.8898</w:t>
+            </w:r>
+          </w:p>
+        </w:tc>
+        <w:tc>
+          <w:tcPr>
+            <w:tcW w:w="1144" w:type="dxa"/>
+            <w:tcBorders>
+              <w:top w:val="single" w:sz="12" w:space="0" w:color="666666"/>
+              <w:left w:val="none" w:sz="0" w:space="0" w:color="000000"/>
+              <w:bottom w:val="single" w:sz="6" w:space="0" w:color="666666"/>
+              <w:right w:val="none" w:sz="0" w:space="0" w:color="000000"/>
+            </w:tcBorders>
+            <w:shd w:val="clear" w:color="auto" w:fill="FFFFFF"/>
+            <w:tcMar>
+              <w:top w:w="0" w:type="dxa"/>
+              <w:left w:w="0" w:type="dxa"/>
+              <w:bottom w:w="0" w:type="dxa"/>
+              <w:right w:w="0" w:type="dxa"/>
+            </w:tcMar>
+            <w:vAlign w:val="center"/>
+          </w:tcPr>
+          <w:p>
+            <w:pPr>
+              <w:pBdr>
+                <w:top w:val="none" w:sz="0" w:space="0" w:color="000000"/>
+                <w:left w:val="none" w:sz="0" w:space="0" w:color="000000"/>
+                <w:bottom w:val="none" w:sz="0" w:space="0" w:color="000000"/>
+                <w:right w:val="none" w:sz="0" w:space="0" w:color="000000"/>
+              </w:pBdr>
+              <w:spacing w:before="100" w:after="100"/>
+              <w:ind w:left="100" w:right="100"/>
+              <w:jc w:val="center"/>
+              <w:rPr>
+                <w:rFonts w:eastAsia="Helvetica"/>
+                <w:color w:val="000000"/>
+              </w:rPr>
+            </w:pPr>
+            <w:r>
+              <w:rPr>
+                <w:rFonts w:eastAsia="Helvetica"/>
+                <w:color w:val="000000"/>
+              </w:rPr>
+              <w:t>0.0000</w:t>
+            </w:r>
+          </w:p>
+        </w:tc>
+        <w:tc>
+          <w:tcPr>
+            <w:tcW w:w="1080" w:type="dxa"/>
+            <w:tcBorders>
+              <w:top w:val="single" w:sz="12" w:space="0" w:color="666666"/>
+              <w:left w:val="none" w:sz="0" w:space="0" w:color="000000"/>
+              <w:bottom w:val="single" w:sz="6" w:space="0" w:color="666666"/>
+              <w:right w:val="none" w:sz="0" w:space="0" w:color="000000"/>
+            </w:tcBorders>
+            <w:shd w:val="clear" w:color="auto" w:fill="FFFFFF"/>
+            <w:tcMar>
+              <w:top w:w="0" w:type="dxa"/>
+              <w:left w:w="0" w:type="dxa"/>
+              <w:bottom w:w="0" w:type="dxa"/>
+              <w:right w:w="0" w:type="dxa"/>
+            </w:tcMar>
+            <w:vAlign w:val="center"/>
+          </w:tcPr>
+          <w:p>
+            <w:pPr>
+              <w:pBdr>
+                <w:top w:val="none" w:sz="0" w:space="0" w:color="000000"/>
+                <w:left w:val="none" w:sz="0" w:space="0" w:color="000000"/>
+                <w:bottom w:val="none" w:sz="0" w:space="0" w:color="000000"/>
+                <w:right w:val="none" w:sz="0" w:space="0" w:color="000000"/>
+              </w:pBdr>
+              <w:spacing w:before="100" w:after="100"/>
+              <w:ind w:left="100" w:right="100"/>
+              <w:jc w:val="center"/>
+              <w:rPr>
+                <w:rFonts w:eastAsia="Helvetica"/>
+                <w:color w:val="000000"/>
+              </w:rPr>
+            </w:pPr>
+            <w:r>
+              <w:rPr>
+                <w:rFonts w:eastAsia="Helvetica"/>
+                <w:color w:val="000000"/>
+              </w:rPr>
+              <w:t>***</w:t>
+            </w:r>
+          </w:p>
+        </w:tc>
+      </w:tr>
+      <w:tr>
+        <w:trPr>
+          <w:jc w:val="center"/>
+        </w:trPr>
+        <w:tc>
+          <w:tcPr>
+            <w:tcW w:w="3309" w:type="dxa"/>
+            <w:tcBorders>
+              <w:top w:val="single" w:sz="6" w:space="0" w:color="666666"/>
+              <w:left w:val="none" w:sz="0" w:space="0" w:color="000000"/>
+              <w:bottom w:val="single" w:sz="6" w:space="0" w:color="666666"/>
+              <w:right w:val="none" w:sz="0" w:space="0" w:color="000000"/>
+            </w:tcBorders>
+            <w:shd w:val="clear" w:color="auto" w:fill="FFFFFF"/>
+            <w:tcMar>
+              <w:top w:w="0" w:type="dxa"/>
+              <w:left w:w="0" w:type="dxa"/>
+              <w:bottom w:w="0" w:type="dxa"/>
+              <w:right w:w="0" w:type="dxa"/>
+            </w:tcMar>
+            <w:vAlign w:val="center"/>
+          </w:tcPr>
+          <w:p>
+            <w:pPr>
+              <w:pBdr>
+                <w:top w:val="none" w:sz="0" w:space="0" w:color="000000"/>
+                <w:left w:val="none" w:sz="0" w:space="0" w:color="000000"/>
+                <w:bottom w:val="none" w:sz="0" w:space="0" w:color="000000"/>
+                <w:right w:val="none" w:sz="0" w:space="0" w:color="000000"/>
+              </w:pBdr>
+              <w:spacing w:before="100" w:after="100"/>
+              <w:ind w:left="100" w:right="100"/>
+              <w:rPr>
+                <w:rFonts w:eastAsia="Helvetica"/>
+                <w:color w:val="000000"/>
+              </w:rPr>
+            </w:pPr>
+            <w:r>
+              <w:rPr>
+                <w:rFonts w:eastAsia="Helvetica"/>
+                <w:color w:val="000000"/>
+              </w:rPr>
+              <w:t>Gasto_Publicidad</w:t>
+            </w:r>
+          </w:p>
+        </w:tc>
+        <w:tc>
+          <w:tcPr>
+            <w:tcW w:w="1596" w:type="dxa"/>
+            <w:tcBorders>
+              <w:top w:val="single" w:sz="6" w:space="0" w:color="666666"/>
+              <w:left w:val="none" w:sz="0" w:space="0" w:color="000000"/>
+              <w:bottom w:val="single" w:sz="6" w:space="0" w:color="666666"/>
+              <w:right w:val="none" w:sz="0" w:space="0" w:color="000000"/>
+            </w:tcBorders>
+            <w:shd w:val="clear" w:color="auto" w:fill="FFFFFF"/>
+            <w:tcMar>
+              <w:top w:w="0" w:type="dxa"/>
+              <w:left w:w="0" w:type="dxa"/>
+              <w:bottom w:w="0" w:type="dxa"/>
+              <w:right w:w="0" w:type="dxa"/>
+            </w:tcMar>
+            <w:vAlign w:val="center"/>
+          </w:tcPr>
+          <w:p>
+            <w:pPr>
+              <w:pBdr>
+                <w:top w:val="none" w:sz="0" w:space="0" w:color="000000"/>
+                <w:left w:val="none" w:sz="0" w:space="0" w:color="000000"/>
+                <w:bottom w:val="none" w:sz="0" w:space="0" w:color="000000"/>
+                <w:right w:val="none" w:sz="0" w:space="0" w:color="000000"/>
+              </w:pBdr>
+              <w:spacing w:before="100" w:after="100"/>
+              <w:ind w:left="100" w:right="100"/>
+              <w:jc w:val="center"/>
+              <w:rPr>
+                <w:rFonts w:eastAsia="Helvetica"/>
+                <w:color w:val="000000"/>
+              </w:rPr>
+            </w:pPr>
+            <w:r>
+              <w:rPr>
+                <w:rFonts w:eastAsia="Helvetica"/>
+                <w:color w:val="000000"/>
+              </w:rPr>
+              <w:t>0.0000</w:t>
+            </w:r>
+          </w:p>
+        </w:tc>
+        <w:tc>
+          <w:tcPr>
+            <w:tcW w:w="1413" w:type="dxa"/>
+            <w:tcBorders>
+              <w:top w:val="single" w:sz="6" w:space="0" w:color="666666"/>
+              <w:left w:val="none" w:sz="0" w:space="0" w:color="000000"/>
+              <w:bottom w:val="single" w:sz="6" w:space="0" w:color="666666"/>
+              <w:right w:val="none" w:sz="0" w:space="0" w:color="000000"/>
+            </w:tcBorders>
+            <w:shd w:val="clear" w:color="auto" w:fill="FFFFFF"/>
+            <w:tcMar>
+              <w:top w:w="0" w:type="dxa"/>
+              <w:left w:w="0" w:type="dxa"/>
+              <w:bottom w:w="0" w:type="dxa"/>
+              <w:right w:w="0" w:type="dxa"/>
+            </w:tcMar>
+            <w:vAlign w:val="center"/>
+          </w:tcPr>
+          <w:p>
+            <w:pPr>
+              <w:pBdr>
+                <w:top w:val="none" w:sz="0" w:space="0" w:color="000000"/>
+                <w:left w:val="none" w:sz="0" w:space="0" w:color="000000"/>
+                <w:bottom w:val="none" w:sz="0" w:space="0" w:color="000000"/>
+                <w:right w:val="none" w:sz="0" w:space="0" w:color="000000"/>
+              </w:pBdr>
+              <w:spacing w:before="100" w:after="100"/>
+              <w:ind w:left="100" w:right="100"/>
+              <w:jc w:val="center"/>
+              <w:rPr>
+                <w:rFonts w:eastAsia="Helvetica"/>
+                <w:color w:val="000000"/>
+              </w:rPr>
+            </w:pPr>
+            <w:r>
+              <w:rPr>
+                <w:rFonts w:eastAsia="Helvetica"/>
+                <w:color w:val="000000"/>
+              </w:rPr>
+              <w:t>0.0000</w:t>
+            </w:r>
+          </w:p>
+        </w:tc>
+        <w:tc>
+          <w:tcPr>
+            <w:tcW w:w="1206" w:type="dxa"/>
+            <w:tcBorders>
+              <w:top w:val="single" w:sz="6" w:space="0" w:color="666666"/>
+              <w:left w:val="none" w:sz="0" w:space="0" w:color="000000"/>
+              <w:bottom w:val="single" w:sz="6" w:space="0" w:color="666666"/>
+              <w:right w:val="none" w:sz="0" w:space="0" w:color="000000"/>
+            </w:tcBorders>
+            <w:shd w:val="clear" w:color="auto" w:fill="FFFFFF"/>
+            <w:tcMar>
+              <w:top w:w="0" w:type="dxa"/>
+              <w:left w:w="0" w:type="dxa"/>
+              <w:bottom w:w="0" w:type="dxa"/>
+              <w:right w:w="0" w:type="dxa"/>
+            </w:tcMar>
+            <w:vAlign w:val="center"/>
+          </w:tcPr>
+          <w:p>
+            <w:pPr>
+              <w:pBdr>
+                <w:top w:val="none" w:sz="0" w:space="0" w:color="000000"/>
+                <w:left w:val="none" w:sz="0" w:space="0" w:color="000000"/>
+                <w:bottom w:val="none" w:sz="0" w:space="0" w:color="000000"/>
+                <w:right w:val="none" w:sz="0" w:space="0" w:color="000000"/>
+              </w:pBdr>
+              <w:spacing w:before="100" w:after="100"/>
+              <w:ind w:left="100" w:right="100"/>
+              <w:jc w:val="center"/>
+              <w:rPr>
+                <w:rFonts w:eastAsia="Helvetica"/>
+                <w:color w:val="000000"/>
+              </w:rPr>
+            </w:pPr>
+            <w:r>
+              <w:rPr>
+                <w:rFonts w:eastAsia="Helvetica"/>
+                <w:color w:val="000000"/>
+              </w:rPr>
+              <w:t>2.0419</w:t>
+            </w:r>
+          </w:p>
+        </w:tc>
+        <w:tc>
+          <w:tcPr>
+            <w:tcW w:w="1144" w:type="dxa"/>
+            <w:tcBorders>
+              <w:top w:val="single" w:sz="6" w:space="0" w:color="666666"/>
+              <w:left w:val="none" w:sz="0" w:space="0" w:color="000000"/>
+              <w:bottom w:val="single" w:sz="6" w:space="0" w:color="666666"/>
+              <w:right w:val="none" w:sz="0" w:space="0" w:color="000000"/>
+            </w:tcBorders>
+            <w:shd w:val="clear" w:color="auto" w:fill="FFFFFF"/>
+            <w:tcMar>
+              <w:top w:w="0" w:type="dxa"/>
+              <w:left w:w="0" w:type="dxa"/>
+              <w:bottom w:w="0" w:type="dxa"/>
+              <w:right w:w="0" w:type="dxa"/>
+            </w:tcMar>
+            <w:vAlign w:val="center"/>
+          </w:tcPr>
+          <w:p>
+            <w:pPr>
+              <w:pBdr>
+                <w:top w:val="none" w:sz="0" w:space="0" w:color="000000"/>
+                <w:left w:val="none" w:sz="0" w:space="0" w:color="000000"/>
+                <w:bottom w:val="none" w:sz="0" w:space="0" w:color="000000"/>
+                <w:right w:val="none" w:sz="0" w:space="0" w:color="000000"/>
+              </w:pBdr>
+              <w:spacing w:before="100" w:after="100"/>
+              <w:ind w:left="100" w:right="100"/>
+              <w:jc w:val="center"/>
+              <w:rPr>
+                <w:rFonts w:eastAsia="Helvetica"/>
+                <w:color w:val="000000"/>
+              </w:rPr>
+            </w:pPr>
+            <w:r>
+              <w:rPr>
+                <w:rFonts w:eastAsia="Helvetica"/>
+                <w:color w:val="000000"/>
+              </w:rPr>
+              <w:t>0.0435</w:t>
+            </w:r>
+          </w:p>
+        </w:tc>
+        <w:tc>
+          <w:tcPr>
+            <w:tcW w:w="1080" w:type="dxa"/>
+            <w:tcBorders>
+              <w:top w:val="single" w:sz="6" w:space="0" w:color="666666"/>
+              <w:left w:val="none" w:sz="0" w:space="0" w:color="000000"/>
+              <w:bottom w:val="single" w:sz="6" w:space="0" w:color="666666"/>
+              <w:right w:val="none" w:sz="0" w:space="0" w:color="000000"/>
+            </w:tcBorders>
+            <w:shd w:val="clear" w:color="auto" w:fill="FFFFFF"/>
+            <w:tcMar>
+              <w:top w:w="0" w:type="dxa"/>
+              <w:left w:w="0" w:type="dxa"/>
+              <w:bottom w:w="0" w:type="dxa"/>
+              <w:right w:w="0" w:type="dxa"/>
+            </w:tcMar>
+            <w:vAlign w:val="center"/>
+          </w:tcPr>
+          <w:p>
+            <w:pPr>
+              <w:pBdr>
+                <w:top w:val="none" w:sz="0" w:space="0" w:color="000000"/>
+                <w:left w:val="none" w:sz="0" w:space="0" w:color="000000"/>
+                <w:bottom w:val="none" w:sz="0" w:space="0" w:color="000000"/>
+                <w:right w:val="none" w:sz="0" w:space="0" w:color="000000"/>
+              </w:pBdr>
+              <w:spacing w:before="100" w:after="100"/>
+              <w:ind w:left="100" w:right="100"/>
+              <w:jc w:val="center"/>
+              <w:rPr>
+                <w:rFonts w:eastAsia="Helvetica"/>
+                <w:color w:val="000000"/>
+              </w:rPr>
+            </w:pPr>
+            <w:r>
+              <w:rPr>
+                <w:rFonts w:eastAsia="Helvetica"/>
+                <w:color w:val="000000"/>
+              </w:rPr>
+              <w:t>*</w:t>
+            </w:r>
+          </w:p>
+        </w:tc>
+      </w:tr>
+      <w:tr>
+        <w:trPr>
+          <w:jc w:val="center"/>
+        </w:trPr>
+        <w:tc>
+          <w:tcPr>
+            <w:tcW w:w="3309" w:type="dxa"/>
+            <w:tcBorders>
+              <w:top w:val="single" w:sz="6" w:space="0" w:color="666666"/>
+              <w:left w:val="none" w:sz="0" w:space="0" w:color="000000"/>
+              <w:bottom w:val="single" w:sz="6" w:space="0" w:color="666666"/>
+              <w:right w:val="none" w:sz="0" w:space="0" w:color="000000"/>
+            </w:tcBorders>
+            <w:shd w:val="clear" w:color="auto" w:fill="FFFFFF"/>
+            <w:tcMar>
+              <w:top w:w="0" w:type="dxa"/>
+              <w:left w:w="0" w:type="dxa"/>
+              <w:bottom w:w="0" w:type="dxa"/>
+              <w:right w:w="0" w:type="dxa"/>
+            </w:tcMar>
+            <w:vAlign w:val="center"/>
+          </w:tcPr>
+          <w:p>
+            <w:pPr>
+              <w:pBdr>
+                <w:top w:val="none" w:sz="0" w:space="0" w:color="000000"/>
+                <w:left w:val="none" w:sz="0" w:space="0" w:color="000000"/>
+                <w:bottom w:val="none" w:sz="0" w:space="0" w:color="000000"/>
+                <w:right w:val="none" w:sz="0" w:space="0" w:color="000000"/>
+              </w:pBdr>
+              <w:spacing w:before="100" w:after="100"/>
+              <w:ind w:left="100" w:right="100"/>
+              <w:rPr>
+                <w:rFonts w:eastAsia="Helvetica"/>
+                <w:color w:val="000000"/>
+              </w:rPr>
+            </w:pPr>
+            <w:r>
+              <w:rPr>
+                <w:rFonts w:eastAsia="Helvetica"/>
+                <w:color w:val="000000"/>
+              </w:rPr>
+              <w:t>Holliday_seasson</w:t>
+            </w:r>
+          </w:p>
+        </w:tc>
+        <w:tc>
+          <w:tcPr>
+            <w:tcW w:w="1596" w:type="dxa"/>
+            <w:tcBorders>
+              <w:top w:val="single" w:sz="6" w:space="0" w:color="666666"/>
+              <w:left w:val="none" w:sz="0" w:space="0" w:color="000000"/>
+              <w:bottom w:val="single" w:sz="6" w:space="0" w:color="666666"/>
+              <w:right w:val="none" w:sz="0" w:space="0" w:color="000000"/>
+            </w:tcBorders>
+            <w:shd w:val="clear" w:color="auto" w:fill="FFFFFF"/>
+            <w:tcMar>
+              <w:top w:w="0" w:type="dxa"/>
+              <w:left w:w="0" w:type="dxa"/>
+              <w:bottom w:w="0" w:type="dxa"/>
+              <w:right w:w="0" w:type="dxa"/>
+            </w:tcMar>
+            <w:vAlign w:val="center"/>
+          </w:tcPr>
+          <w:p>
+            <w:pPr>
+              <w:pBdr>
+                <w:top w:val="none" w:sz="0" w:space="0" w:color="000000"/>
+                <w:left w:val="none" w:sz="0" w:space="0" w:color="000000"/>
+                <w:bottom w:val="none" w:sz="0" w:space="0" w:color="000000"/>
+                <w:right w:val="none" w:sz="0" w:space="0" w:color="000000"/>
+              </w:pBdr>
+              <w:spacing w:before="100" w:after="100"/>
+              <w:ind w:left="100" w:right="100"/>
+              <w:jc w:val="center"/>
+              <w:rPr>
+                <w:rFonts w:eastAsia="Helvetica"/>
+                <w:color w:val="000000"/>
+              </w:rPr>
+            </w:pPr>
+            <w:r>
+              <w:rPr>
+                <w:rFonts w:eastAsia="Helvetica"/>
+                <w:color w:val="000000"/>
+              </w:rPr>
+              <w:t>-0.7267</w:t>
+            </w:r>
+          </w:p>
+        </w:tc>
+        <w:tc>
+          <w:tcPr>
+            <w:tcW w:w="1413" w:type="dxa"/>
+            <w:tcBorders>
+              <w:top w:val="single" w:sz="6" w:space="0" w:color="666666"/>
+              <w:left w:val="none" w:sz="0" w:space="0" w:color="000000"/>
+              <w:bottom w:val="single" w:sz="6" w:space="0" w:color="666666"/>
+              <w:right w:val="none" w:sz="0" w:space="0" w:color="000000"/>
+            </w:tcBorders>
+            <w:shd w:val="clear" w:color="auto" w:fill="FFFFFF"/>
+            <w:tcMar>
+              <w:top w:w="0" w:type="dxa"/>
+              <w:left w:w="0" w:type="dxa"/>
+              <w:bottom w:w="0" w:type="dxa"/>
+              <w:right w:w="0" w:type="dxa"/>
+            </w:tcMar>
+            <w:vAlign w:val="center"/>
+          </w:tcPr>
+          <w:p>
+            <w:pPr>
+              <w:pBdr>
+                <w:top w:val="none" w:sz="0" w:space="0" w:color="000000"/>
+                <w:left w:val="none" w:sz="0" w:space="0" w:color="000000"/>
+                <w:bottom w:val="none" w:sz="0" w:space="0" w:color="000000"/>
+                <w:right w:val="none" w:sz="0" w:space="0" w:color="000000"/>
+              </w:pBdr>
+              <w:spacing w:before="100" w:after="100"/>
+              <w:ind w:left="100" w:right="100"/>
+              <w:jc w:val="center"/>
+              <w:rPr>
+                <w:rFonts w:eastAsia="Helvetica"/>
+                <w:color w:val="000000"/>
+              </w:rPr>
+            </w:pPr>
+            <w:r>
+              <w:rPr>
+                <w:rFonts w:eastAsia="Helvetica"/>
+                <w:color w:val="000000"/>
+              </w:rPr>
+              <w:t>0.1179</w:t>
+            </w:r>
+          </w:p>
+        </w:tc>
+        <w:tc>
+          <w:tcPr>
+            <w:tcW w:w="1206" w:type="dxa"/>
+            <w:tcBorders>
+              <w:top w:val="single" w:sz="6" w:space="0" w:color="666666"/>
+              <w:left w:val="none" w:sz="0" w:space="0" w:color="000000"/>
+              <w:bottom w:val="single" w:sz="6" w:space="0" w:color="666666"/>
+              <w:right w:val="none" w:sz="0" w:space="0" w:color="000000"/>
+            </w:tcBorders>
+            <w:shd w:val="clear" w:color="auto" w:fill="FFFFFF"/>
+            <w:tcMar>
+              <w:top w:w="0" w:type="dxa"/>
+              <w:left w:w="0" w:type="dxa"/>
+              <w:bottom w:w="0" w:type="dxa"/>
+              <w:right w:w="0" w:type="dxa"/>
+            </w:tcMar>
+            <w:vAlign w:val="center"/>
+          </w:tcPr>
+          <w:p>
+            <w:pPr>
+              <w:pBdr>
+                <w:top w:val="none" w:sz="0" w:space="0" w:color="000000"/>
+                <w:left w:val="none" w:sz="0" w:space="0" w:color="000000"/>
+                <w:bottom w:val="none" w:sz="0" w:space="0" w:color="000000"/>
+                <w:right w:val="none" w:sz="0" w:space="0" w:color="000000"/>
+              </w:pBdr>
+              <w:spacing w:before="100" w:after="100"/>
+              <w:ind w:left="100" w:right="100"/>
+              <w:jc w:val="center"/>
+              <w:rPr>
+                <w:rFonts w:eastAsia="Helvetica"/>
+                <w:color w:val="000000"/>
+              </w:rPr>
+            </w:pPr>
+            <w:r>
+              <w:rPr>
+                <w:rFonts w:eastAsia="Helvetica"/>
+                <w:color w:val="000000"/>
+              </w:rPr>
+              <w:t>-6.1661</w:t>
+            </w:r>
+          </w:p>
+        </w:tc>
+        <w:tc>
+          <w:tcPr>
+            <w:tcW w:w="1144" w:type="dxa"/>
+            <w:tcBorders>
+              <w:top w:val="single" w:sz="6" w:space="0" w:color="666666"/>
+              <w:left w:val="none" w:sz="0" w:space="0" w:color="000000"/>
+              <w:bottom w:val="single" w:sz="6" w:space="0" w:color="666666"/>
+              <w:right w:val="none" w:sz="0" w:space="0" w:color="000000"/>
+            </w:tcBorders>
+            <w:shd w:val="clear" w:color="auto" w:fill="FFFFFF"/>
+            <w:tcMar>
+              <w:top w:w="0" w:type="dxa"/>
+              <w:left w:w="0" w:type="dxa"/>
+              <w:bottom w:w="0" w:type="dxa"/>
+              <w:right w:w="0" w:type="dxa"/>
+            </w:tcMar>
+            <w:vAlign w:val="center"/>
+          </w:tcPr>
+          <w:p>
+            <w:pPr>
+              <w:pBdr>
+                <w:top w:val="none" w:sz="0" w:space="0" w:color="000000"/>
+                <w:left w:val="none" w:sz="0" w:space="0" w:color="000000"/>
+                <w:bottom w:val="none" w:sz="0" w:space="0" w:color="000000"/>
+                <w:right w:val="none" w:sz="0" w:space="0" w:color="000000"/>
+              </w:pBdr>
+              <w:spacing w:before="100" w:after="100"/>
+              <w:ind w:left="100" w:right="100"/>
+              <w:jc w:val="center"/>
+              <w:rPr>
+                <w:rFonts w:eastAsia="Helvetica"/>
+                <w:color w:val="000000"/>
+              </w:rPr>
+            </w:pPr>
+            <w:r>
+              <w:rPr>
+                <w:rFonts w:eastAsia="Helvetica"/>
+                <w:color w:val="000000"/>
+              </w:rPr>
+              <w:t>0.0000</w:t>
+            </w:r>
+          </w:p>
+        </w:tc>
+        <w:tc>
+          <w:tcPr>
+            <w:tcW w:w="1080" w:type="dxa"/>
+            <w:tcBorders>
+              <w:top w:val="single" w:sz="6" w:space="0" w:color="666666"/>
+              <w:left w:val="none" w:sz="0" w:space="0" w:color="000000"/>
+              <w:bottom w:val="single" w:sz="6" w:space="0" w:color="666666"/>
+              <w:right w:val="none" w:sz="0" w:space="0" w:color="000000"/>
+            </w:tcBorders>
+            <w:shd w:val="clear" w:color="auto" w:fill="FFFFFF"/>
+            <w:tcMar>
+              <w:top w:w="0" w:type="dxa"/>
+              <w:left w:w="0" w:type="dxa"/>
+              <w:bottom w:w="0" w:type="dxa"/>
+              <w:right w:w="0" w:type="dxa"/>
+            </w:tcMar>
+            <w:vAlign w:val="center"/>
+          </w:tcPr>
+          <w:p>
+            <w:pPr>
+              <w:pBdr>
+                <w:top w:val="none" w:sz="0" w:space="0" w:color="000000"/>
+                <w:left w:val="none" w:sz="0" w:space="0" w:color="000000"/>
+                <w:bottom w:val="none" w:sz="0" w:space="0" w:color="000000"/>
+                <w:right w:val="none" w:sz="0" w:space="0" w:color="000000"/>
+              </w:pBdr>
+              <w:spacing w:before="100" w:after="100"/>
+              <w:ind w:left="100" w:right="100"/>
+              <w:jc w:val="center"/>
+              <w:rPr>
+                <w:rFonts w:eastAsia="Helvetica"/>
+                <w:color w:val="000000"/>
+              </w:rPr>
+            </w:pPr>
+            <w:r>
+              <w:rPr>
+                <w:rFonts w:eastAsia="Helvetica"/>
+                <w:color w:val="000000"/>
+              </w:rPr>
+              <w:t>***</w:t>
+            </w:r>
+          </w:p>
+        </w:tc>
+      </w:tr>
+      <w:tr>
+        <w:trPr>
+          <w:jc w:val="center"/>
+        </w:trPr>
+        <w:tc>
+          <w:tcPr>
+            <w:tcW w:w="3309" w:type="dxa"/>
+            <w:tcBorders>
+              <w:top w:val="single" w:sz="6" w:space="0" w:color="666666"/>
+              <w:left w:val="none" w:sz="0" w:space="0" w:color="000000"/>
+              <w:bottom w:val="single" w:sz="6" w:space="0" w:color="666666"/>
+              <w:right w:val="none" w:sz="0" w:space="0" w:color="000000"/>
+            </w:tcBorders>
+            <w:shd w:val="clear" w:color="auto" w:fill="FFFFFF"/>
+            <w:tcMar>
+              <w:top w:w="0" w:type="dxa"/>
+              <w:left w:w="0" w:type="dxa"/>
+              <w:bottom w:w="0" w:type="dxa"/>
+              <w:right w:w="0" w:type="dxa"/>
+            </w:tcMar>
+            <w:vAlign w:val="center"/>
+          </w:tcPr>
+          <w:p>
+            <w:pPr>
+              <w:pBdr>
+                <w:top w:val="none" w:sz="0" w:space="0" w:color="000000"/>
+                <w:left w:val="none" w:sz="0" w:space="0" w:color="000000"/>
+                <w:bottom w:val="none" w:sz="0" w:space="0" w:color="000000"/>
+                <w:right w:val="none" w:sz="0" w:space="0" w:color="000000"/>
+              </w:pBdr>
+              <w:spacing w:before="100" w:after="100"/>
+              <w:ind w:left="100" w:right="100"/>
+              <w:rPr>
+                <w:rFonts w:eastAsia="Helvetica"/>
+                <w:color w:val="000000"/>
+              </w:rPr>
+            </w:pPr>
+            <w:r>
+              <w:rPr>
+                <w:rFonts w:eastAsia="Helvetica"/>
+                <w:color w:val="000000"/>
+              </w:rPr>
+              <w:t>Flights_to_Nashville</w:t>
+            </w:r>
+          </w:p>
+        </w:tc>
+        <w:tc>
+          <w:tcPr>
+            <w:tcW w:w="1596" w:type="dxa"/>
+            <w:tcBorders>
+              <w:top w:val="single" w:sz="6" w:space="0" w:color="666666"/>
+              <w:left w:val="none" w:sz="0" w:space="0" w:color="000000"/>
+              <w:bottom w:val="single" w:sz="6" w:space="0" w:color="666666"/>
+              <w:right w:val="none" w:sz="0" w:space="0" w:color="000000"/>
+            </w:tcBorders>
+            <w:shd w:val="clear" w:color="auto" w:fill="FFFFFF"/>
+            <w:tcMar>
+              <w:top w:w="0" w:type="dxa"/>
+              <w:left w:w="0" w:type="dxa"/>
+              <w:bottom w:w="0" w:type="dxa"/>
+              <w:right w:w="0" w:type="dxa"/>
+            </w:tcMar>
+            <w:vAlign w:val="center"/>
+          </w:tcPr>
+          <w:p>
+            <w:pPr>
+              <w:pBdr>
+                <w:top w:val="none" w:sz="0" w:space="0" w:color="000000"/>
+                <w:left w:val="none" w:sz="0" w:space="0" w:color="000000"/>
+                <w:bottom w:val="none" w:sz="0" w:space="0" w:color="000000"/>
+                <w:right w:val="none" w:sz="0" w:space="0" w:color="000000"/>
+              </w:pBdr>
+              <w:spacing w:before="100" w:after="100"/>
+              <w:ind w:left="100" w:right="100"/>
+              <w:jc w:val="center"/>
+              <w:rPr>
+                <w:rFonts w:eastAsia="Helvetica"/>
+                <w:color w:val="000000"/>
+              </w:rPr>
+            </w:pPr>
+            <w:r>
+              <w:rPr>
+                <w:rFonts w:eastAsia="Helvetica"/>
+                <w:color w:val="000000"/>
+              </w:rPr>
+              <w:t>0.0000</w:t>
+            </w:r>
+          </w:p>
+        </w:tc>
+        <w:tc>
+          <w:tcPr>
+            <w:tcW w:w="1413" w:type="dxa"/>
+            <w:tcBorders>
+              <w:top w:val="single" w:sz="6" w:space="0" w:color="666666"/>
+              <w:left w:val="none" w:sz="0" w:space="0" w:color="000000"/>
+              <w:bottom w:val="single" w:sz="6" w:space="0" w:color="666666"/>
+              <w:right w:val="none" w:sz="0" w:space="0" w:color="000000"/>
+            </w:tcBorders>
+            <w:shd w:val="clear" w:color="auto" w:fill="FFFFFF"/>
+            <w:tcMar>
+              <w:top w:w="0" w:type="dxa"/>
+              <w:left w:w="0" w:type="dxa"/>
+              <w:bottom w:w="0" w:type="dxa"/>
+              <w:right w:w="0" w:type="dxa"/>
+            </w:tcMar>
+            <w:vAlign w:val="center"/>
+          </w:tcPr>
+          <w:p>
+            <w:pPr>
+              <w:pBdr>
+                <w:top w:val="none" w:sz="0" w:space="0" w:color="000000"/>
+                <w:left w:val="none" w:sz="0" w:space="0" w:color="000000"/>
+                <w:bottom w:val="none" w:sz="0" w:space="0" w:color="000000"/>
+                <w:right w:val="none" w:sz="0" w:space="0" w:color="000000"/>
+              </w:pBdr>
+              <w:spacing w:before="100" w:after="100"/>
+              <w:ind w:left="100" w:right="100"/>
+              <w:jc w:val="center"/>
+              <w:rPr>
+                <w:rFonts w:eastAsia="Helvetica"/>
+                <w:color w:val="000000"/>
+              </w:rPr>
+            </w:pPr>
+            <w:r>
+              <w:rPr>
+                <w:rFonts w:eastAsia="Helvetica"/>
+                <w:color w:val="000000"/>
+              </w:rPr>
+              <w:t>0.0000</w:t>
+            </w:r>
+          </w:p>
+        </w:tc>
+        <w:tc>
+          <w:tcPr>
+            <w:tcW w:w="1206" w:type="dxa"/>
+            <w:tcBorders>
+              <w:top w:val="single" w:sz="6" w:space="0" w:color="666666"/>
+              <w:left w:val="none" w:sz="0" w:space="0" w:color="000000"/>
+              <w:bottom w:val="single" w:sz="6" w:space="0" w:color="666666"/>
+              <w:right w:val="none" w:sz="0" w:space="0" w:color="000000"/>
+            </w:tcBorders>
+            <w:shd w:val="clear" w:color="auto" w:fill="FFFFFF"/>
+            <w:tcMar>
+              <w:top w:w="0" w:type="dxa"/>
+              <w:left w:w="0" w:type="dxa"/>
+              <w:bottom w:w="0" w:type="dxa"/>
+              <w:right w:w="0" w:type="dxa"/>
+            </w:tcMar>
+            <w:vAlign w:val="center"/>
+          </w:tcPr>
+          <w:p>
+            <w:pPr>
+              <w:pBdr>
+                <w:top w:val="none" w:sz="0" w:space="0" w:color="000000"/>
+                <w:left w:val="none" w:sz="0" w:space="0" w:color="000000"/>
+                <w:bottom w:val="none" w:sz="0" w:space="0" w:color="000000"/>
+                <w:right w:val="none" w:sz="0" w:space="0" w:color="000000"/>
+              </w:pBdr>
+              <w:spacing w:before="100" w:after="100"/>
+              <w:ind w:left="100" w:right="100"/>
+              <w:jc w:val="center"/>
+              <w:rPr>
+                <w:rFonts w:eastAsia="Helvetica"/>
+                <w:color w:val="000000"/>
+              </w:rPr>
+            </w:pPr>
+            <w:r>
+              <w:rPr>
+                <w:rFonts w:eastAsia="Helvetica"/>
+                <w:color w:val="000000"/>
+              </w:rPr>
+              <w:t>0.7171</w:t>
+            </w:r>
+          </w:p>
+        </w:tc>
+        <w:tc>
+          <w:tcPr>
+            <w:tcW w:w="1144" w:type="dxa"/>
+            <w:tcBorders>
+              <w:top w:val="single" w:sz="6" w:space="0" w:color="666666"/>
+              <w:left w:val="none" w:sz="0" w:space="0" w:color="000000"/>
+              <w:bottom w:val="single" w:sz="6" w:space="0" w:color="666666"/>
+              <w:right w:val="none" w:sz="0" w:space="0" w:color="000000"/>
+            </w:tcBorders>
+            <w:shd w:val="clear" w:color="auto" w:fill="FFFFFF"/>
+            <w:tcMar>
+              <w:top w:w="0" w:type="dxa"/>
+              <w:left w:w="0" w:type="dxa"/>
+              <w:bottom w:w="0" w:type="dxa"/>
+              <w:right w:w="0" w:type="dxa"/>
+            </w:tcMar>
+            <w:vAlign w:val="center"/>
+          </w:tcPr>
+          <w:p>
+            <w:pPr>
+              <w:pBdr>
+                <w:top w:val="none" w:sz="0" w:space="0" w:color="000000"/>
+                <w:left w:val="none" w:sz="0" w:space="0" w:color="000000"/>
+                <w:bottom w:val="none" w:sz="0" w:space="0" w:color="000000"/>
+                <w:right w:val="none" w:sz="0" w:space="0" w:color="000000"/>
+              </w:pBdr>
+              <w:spacing w:before="100" w:after="100"/>
+              <w:ind w:left="100" w:right="100"/>
+              <w:jc w:val="center"/>
+              <w:rPr>
+                <w:rFonts w:eastAsia="Helvetica"/>
+                <w:color w:val="000000"/>
+              </w:rPr>
+            </w:pPr>
+            <w:r>
+              <w:rPr>
+                <w:rFonts w:eastAsia="Helvetica"/>
+                <w:color w:val="000000"/>
+              </w:rPr>
+              <w:t>0.4749</w:t>
+            </w:r>
+          </w:p>
+        </w:tc>
+        <w:tc>
+          <w:tcPr>
+            <w:tcW w:w="1080" w:type="dxa"/>
+            <w:tcBorders>
+              <w:top w:val="single" w:sz="6" w:space="0" w:color="666666"/>
+              <w:left w:val="none" w:sz="0" w:space="0" w:color="000000"/>
+              <w:bottom w:val="single" w:sz="6" w:space="0" w:color="666666"/>
+              <w:right w:val="none" w:sz="0" w:space="0" w:color="000000"/>
+            </w:tcBorders>
+            <w:shd w:val="clear" w:color="auto" w:fill="FFFFFF"/>
+            <w:tcMar>
+              <w:top w:w="0" w:type="dxa"/>
+              <w:left w:w="0" w:type="dxa"/>
+              <w:bottom w:w="0" w:type="dxa"/>
+              <w:right w:w="0" w:type="dxa"/>
+            </w:tcMar>
+            <w:vAlign w:val="center"/>
+          </w:tcPr>
+          <w:p>
+            <w:pPr>
+              <w:pBdr>
+                <w:top w:val="none" w:sz="0" w:space="0" w:color="000000"/>
+                <w:left w:val="none" w:sz="0" w:space="0" w:color="000000"/>
+                <w:bottom w:val="none" w:sz="0" w:space="0" w:color="000000"/>
+                <w:right w:val="none" w:sz="0" w:space="0" w:color="000000"/>
+              </w:pBdr>
+              <w:spacing w:before="100" w:after="100"/>
+              <w:ind w:left="100" w:right="100"/>
+              <w:jc w:val="center"/>
+              <w:rPr>
+                <w:rFonts w:eastAsia="Helvetica"/>
+                <w:color w:val="000000"/>
+              </w:rPr>
+            </w:pPr>
+          </w:p>
+        </w:tc>
+      </w:tr>
+      <w:tr>
+        <w:trPr>
+          <w:jc w:val="center"/>
+        </w:trPr>
+        <w:tc>
+          <w:tcPr>
+            <w:tcW w:w="3309" w:type="dxa"/>
+            <w:tcBorders>
+              <w:top w:val="single" w:sz="6" w:space="0" w:color="666666"/>
+              <w:left w:val="none" w:sz="0" w:space="0" w:color="000000"/>
+              <w:bottom w:val="single" w:sz="6" w:space="0" w:color="666666"/>
+              <w:right w:val="none" w:sz="0" w:space="0" w:color="000000"/>
+            </w:tcBorders>
+            <w:shd w:val="clear" w:color="auto" w:fill="FFFFFF"/>
+            <w:tcMar>
+              <w:top w:w="0" w:type="dxa"/>
+              <w:left w:w="0" w:type="dxa"/>
+              <w:bottom w:w="0" w:type="dxa"/>
+              <w:right w:w="0" w:type="dxa"/>
+            </w:tcMar>
+            <w:vAlign w:val="center"/>
+          </w:tcPr>
+          <w:p>
+            <w:pPr>
+              <w:pBdr>
+                <w:top w:val="none" w:sz="0" w:space="0" w:color="000000"/>
+                <w:left w:val="none" w:sz="0" w:space="0" w:color="000000"/>
+                <w:bottom w:val="none" w:sz="0" w:space="0" w:color="000000"/>
+                <w:right w:val="none" w:sz="0" w:space="0" w:color="000000"/>
+              </w:pBdr>
+              <w:spacing w:before="100" w:after="100"/>
+              <w:ind w:left="100" w:right="100"/>
+              <w:rPr>
+                <w:rFonts w:eastAsia="Helvetica"/>
+                <w:color w:val="000000"/>
+              </w:rPr>
+            </w:pPr>
+            <w:r>
+              <w:rPr>
+                <w:rFonts w:eastAsia="Helvetica"/>
+                <w:color w:val="000000"/>
+              </w:rPr>
+              <w:t>Google_Trends_Opry</w:t>
+            </w:r>
+          </w:p>
+        </w:tc>
+        <w:tc>
+          <w:tcPr>
+            <w:tcW w:w="1596" w:type="dxa"/>
+            <w:tcBorders>
+              <w:top w:val="single" w:sz="6" w:space="0" w:color="666666"/>
+              <w:left w:val="none" w:sz="0" w:space="0" w:color="000000"/>
+              <w:bottom w:val="single" w:sz="6" w:space="0" w:color="666666"/>
+              <w:right w:val="none" w:sz="0" w:space="0" w:color="000000"/>
+            </w:tcBorders>
+            <w:shd w:val="clear" w:color="auto" w:fill="FFFFFF"/>
+            <w:tcMar>
+              <w:top w:w="0" w:type="dxa"/>
+              <w:left w:w="0" w:type="dxa"/>
+              <w:bottom w:w="0" w:type="dxa"/>
+              <w:right w:w="0" w:type="dxa"/>
+            </w:tcMar>
+            <w:vAlign w:val="center"/>
+          </w:tcPr>
+          <w:p>
+            <w:pPr>
+              <w:pBdr>
+                <w:top w:val="none" w:sz="0" w:space="0" w:color="000000"/>
+                <w:left w:val="none" w:sz="0" w:space="0" w:color="000000"/>
+                <w:bottom w:val="none" w:sz="0" w:space="0" w:color="000000"/>
+                <w:right w:val="none" w:sz="0" w:space="0" w:color="000000"/>
+              </w:pBdr>
+              <w:spacing w:before="100" w:after="100"/>
+              <w:ind w:left="100" w:right="100"/>
+              <w:jc w:val="center"/>
+              <w:rPr>
+                <w:rFonts w:eastAsia="Helvetica"/>
+                <w:color w:val="000000"/>
+              </w:rPr>
+            </w:pPr>
+            <w:r>
+              <w:rPr>
+                <w:rFonts w:eastAsia="Helvetica"/>
+                <w:color w:val="000000"/>
+              </w:rPr>
+              <w:t>0.0017</w:t>
+            </w:r>
+          </w:p>
+        </w:tc>
+        <w:tc>
+          <w:tcPr>
+            <w:tcW w:w="1413" w:type="dxa"/>
+            <w:tcBorders>
+              <w:top w:val="single" w:sz="6" w:space="0" w:color="666666"/>
+              <w:left w:val="none" w:sz="0" w:space="0" w:color="000000"/>
+              <w:bottom w:val="single" w:sz="6" w:space="0" w:color="666666"/>
+              <w:right w:val="none" w:sz="0" w:space="0" w:color="000000"/>
+            </w:tcBorders>
+            <w:shd w:val="clear" w:color="auto" w:fill="FFFFFF"/>
+            <w:tcMar>
+              <w:top w:w="0" w:type="dxa"/>
+              <w:left w:w="0" w:type="dxa"/>
+              <w:bottom w:w="0" w:type="dxa"/>
+              <w:right w:w="0" w:type="dxa"/>
+            </w:tcMar>
+            <w:vAlign w:val="center"/>
+          </w:tcPr>
+          <w:p>
+            <w:pPr>
+              <w:pBdr>
+                <w:top w:val="none" w:sz="0" w:space="0" w:color="000000"/>
+                <w:left w:val="none" w:sz="0" w:space="0" w:color="000000"/>
+                <w:bottom w:val="none" w:sz="0" w:space="0" w:color="000000"/>
+                <w:right w:val="none" w:sz="0" w:space="0" w:color="000000"/>
+              </w:pBdr>
+              <w:spacing w:before="100" w:after="100"/>
+              <w:ind w:left="100" w:right="100"/>
+              <w:jc w:val="center"/>
+              <w:rPr>
+                <w:rFonts w:eastAsia="Helvetica"/>
+                <w:color w:val="000000"/>
+              </w:rPr>
+            </w:pPr>
+            <w:r>
+              <w:rPr>
+                <w:rFonts w:eastAsia="Helvetica"/>
+                <w:color w:val="000000"/>
+              </w:rPr>
+              <w:t>0.0034</w:t>
+            </w:r>
+          </w:p>
+        </w:tc>
+        <w:tc>
+          <w:tcPr>
+            <w:tcW w:w="1206" w:type="dxa"/>
+            <w:tcBorders>
+              <w:top w:val="single" w:sz="6" w:space="0" w:color="666666"/>
+              <w:left w:val="none" w:sz="0" w:space="0" w:color="000000"/>
+              <w:bottom w:val="single" w:sz="6" w:space="0" w:color="666666"/>
+              <w:right w:val="none" w:sz="0" w:space="0" w:color="000000"/>
+            </w:tcBorders>
+            <w:shd w:val="clear" w:color="auto" w:fill="FFFFFF"/>
+            <w:tcMar>
+              <w:top w:w="0" w:type="dxa"/>
+              <w:left w:w="0" w:type="dxa"/>
+              <w:bottom w:w="0" w:type="dxa"/>
+              <w:right w:w="0" w:type="dxa"/>
+            </w:tcMar>
+            <w:vAlign w:val="center"/>
+          </w:tcPr>
+          <w:p>
+            <w:pPr>
+              <w:pBdr>
+                <w:top w:val="none" w:sz="0" w:space="0" w:color="000000"/>
+                <w:left w:val="none" w:sz="0" w:space="0" w:color="000000"/>
+                <w:bottom w:val="none" w:sz="0" w:space="0" w:color="000000"/>
+                <w:right w:val="none" w:sz="0" w:space="0" w:color="000000"/>
+              </w:pBdr>
+              <w:spacing w:before="100" w:after="100"/>
+              <w:ind w:left="100" w:right="100"/>
+              <w:jc w:val="center"/>
+              <w:rPr>
+                <w:rFonts w:eastAsia="Helvetica"/>
+                <w:color w:val="000000"/>
+              </w:rPr>
+            </w:pPr>
+            <w:r>
+              <w:rPr>
+                <w:rFonts w:eastAsia="Helvetica"/>
+                <w:color w:val="000000"/>
+              </w:rPr>
+              <w:t>0.5115</w:t>
+            </w:r>
+          </w:p>
+        </w:tc>
+        <w:tc>
+          <w:tcPr>
+            <w:tcW w:w="1144" w:type="dxa"/>
+            <w:tcBorders>
+              <w:top w:val="single" w:sz="6" w:space="0" w:color="666666"/>
+              <w:left w:val="none" w:sz="0" w:space="0" w:color="000000"/>
+              <w:bottom w:val="single" w:sz="6" w:space="0" w:color="666666"/>
+              <w:right w:val="none" w:sz="0" w:space="0" w:color="000000"/>
+            </w:tcBorders>
+            <w:shd w:val="clear" w:color="auto" w:fill="FFFFFF"/>
+            <w:tcMar>
+              <w:top w:w="0" w:type="dxa"/>
+              <w:left w:w="0" w:type="dxa"/>
+              <w:bottom w:w="0" w:type="dxa"/>
+              <w:right w:w="0" w:type="dxa"/>
+            </w:tcMar>
+            <w:vAlign w:val="center"/>
+          </w:tcPr>
+          <w:p>
+            <w:pPr>
+              <w:pBdr>
+                <w:top w:val="none" w:sz="0" w:space="0" w:color="000000"/>
+                <w:left w:val="none" w:sz="0" w:space="0" w:color="000000"/>
+                <w:bottom w:val="none" w:sz="0" w:space="0" w:color="000000"/>
+                <w:right w:val="none" w:sz="0" w:space="0" w:color="000000"/>
+              </w:pBdr>
+              <w:spacing w:before="100" w:after="100"/>
+              <w:ind w:left="100" w:right="100"/>
+              <w:jc w:val="center"/>
+              <w:rPr>
+                <w:rFonts w:eastAsia="Helvetica"/>
+                <w:color w:val="000000"/>
+              </w:rPr>
+            </w:pPr>
+            <w:r>
+              <w:rPr>
+                <w:rFonts w:eastAsia="Helvetica"/>
+                <w:color w:val="000000"/>
+              </w:rPr>
+              <w:t>0.6100</w:t>
+            </w:r>
+          </w:p>
+        </w:tc>
+        <w:tc>
+          <w:tcPr>
+            <w:tcW w:w="1080" w:type="dxa"/>
+            <w:tcBorders>
+              <w:top w:val="single" w:sz="6" w:space="0" w:color="666666"/>
+              <w:left w:val="none" w:sz="0" w:space="0" w:color="000000"/>
+              <w:bottom w:val="single" w:sz="6" w:space="0" w:color="666666"/>
+              <w:right w:val="none" w:sz="0" w:space="0" w:color="000000"/>
+            </w:tcBorders>
+            <w:shd w:val="clear" w:color="auto" w:fill="FFFFFF"/>
+            <w:tcMar>
+              <w:top w:w="0" w:type="dxa"/>
+              <w:left w:w="0" w:type="dxa"/>
+              <w:bottom w:w="0" w:type="dxa"/>
+              <w:right w:w="0" w:type="dxa"/>
+            </w:tcMar>
+            <w:vAlign w:val="center"/>
+          </w:tcPr>
+          <w:p>
+            <w:pPr>
+              <w:pBdr>
+                <w:top w:val="none" w:sz="0" w:space="0" w:color="000000"/>
+                <w:left w:val="none" w:sz="0" w:space="0" w:color="000000"/>
+                <w:bottom w:val="none" w:sz="0" w:space="0" w:color="000000"/>
+                <w:right w:val="none" w:sz="0" w:space="0" w:color="000000"/>
+              </w:pBdr>
+              <w:spacing w:before="100" w:after="100"/>
+              <w:ind w:left="100" w:right="100"/>
+              <w:jc w:val="center"/>
+              <w:rPr>
+                <w:rFonts w:eastAsia="Helvetica"/>
+                <w:color w:val="000000"/>
+              </w:rPr>
+            </w:pPr>
+          </w:p>
+        </w:tc>
+      </w:tr>
+      <w:tr>
+        <w:trPr>
+          <w:jc w:val="center"/>
+        </w:trPr>
+        <w:tc>
+          <w:tcPr>
+            <w:tcW w:w="3309" w:type="dxa"/>
+            <w:tcBorders>
+              <w:top w:val="single" w:sz="6" w:space="0" w:color="666666"/>
+              <w:left w:val="none" w:sz="0" w:space="0" w:color="000000"/>
+              <w:bottom w:val="single" w:sz="6" w:space="0" w:color="666666"/>
+              <w:right w:val="none" w:sz="0" w:space="0" w:color="000000"/>
+            </w:tcBorders>
+            <w:shd w:val="clear" w:color="auto" w:fill="FFFFFF"/>
+            <w:tcMar>
+              <w:top w:w="0" w:type="dxa"/>
+              <w:left w:w="0" w:type="dxa"/>
+              <w:bottom w:w="0" w:type="dxa"/>
+              <w:right w:w="0" w:type="dxa"/>
+            </w:tcMar>
+            <w:vAlign w:val="center"/>
+          </w:tcPr>
+          <w:p>
+            <w:pPr>
+              <w:pBdr>
+                <w:top w:val="none" w:sz="0" w:space="0" w:color="000000"/>
+                <w:left w:val="none" w:sz="0" w:space="0" w:color="000000"/>
+                <w:bottom w:val="none" w:sz="0" w:space="0" w:color="000000"/>
+                <w:right w:val="none" w:sz="0" w:space="0" w:color="000000"/>
+              </w:pBdr>
+              <w:spacing w:before="100" w:after="100"/>
+              <w:ind w:left="100" w:right="100"/>
+              <w:rPr>
+                <w:rFonts w:eastAsia="Helvetica"/>
+                <w:color w:val="000000"/>
+              </w:rPr>
+            </w:pPr>
+            <w:r>
+              <w:rPr>
+                <w:rFonts w:eastAsia="Helvetica"/>
+                <w:color w:val="000000"/>
+              </w:rPr>
+              <w:t>thanksgiving</w:t>
+            </w:r>
+          </w:p>
+        </w:tc>
+        <w:tc>
+          <w:tcPr>
+            <w:tcW w:w="1596" w:type="dxa"/>
+            <w:tcBorders>
+              <w:top w:val="single" w:sz="6" w:space="0" w:color="666666"/>
+              <w:left w:val="none" w:sz="0" w:space="0" w:color="000000"/>
+              <w:bottom w:val="single" w:sz="6" w:space="0" w:color="666666"/>
+              <w:right w:val="none" w:sz="0" w:space="0" w:color="000000"/>
+            </w:tcBorders>
+            <w:shd w:val="clear" w:color="auto" w:fill="FFFFFF"/>
+            <w:tcMar>
+              <w:top w:w="0" w:type="dxa"/>
+              <w:left w:w="0" w:type="dxa"/>
+              <w:bottom w:w="0" w:type="dxa"/>
+              <w:right w:w="0" w:type="dxa"/>
+            </w:tcMar>
+            <w:vAlign w:val="center"/>
+          </w:tcPr>
+          <w:p>
+            <w:pPr>
+              <w:pBdr>
+                <w:top w:val="none" w:sz="0" w:space="0" w:color="000000"/>
+                <w:left w:val="none" w:sz="0" w:space="0" w:color="000000"/>
+                <w:bottom w:val="none" w:sz="0" w:space="0" w:color="000000"/>
+                <w:right w:val="none" w:sz="0" w:space="0" w:color="000000"/>
+              </w:pBdr>
+              <w:spacing w:before="100" w:after="100"/>
+              <w:ind w:left="100" w:right="100"/>
+              <w:jc w:val="center"/>
+              <w:rPr>
+                <w:rFonts w:eastAsia="Helvetica"/>
+                <w:color w:val="000000"/>
+              </w:rPr>
+            </w:pPr>
+            <w:r>
+              <w:rPr>
+                <w:rFonts w:eastAsia="Helvetica"/>
+                <w:color w:val="000000"/>
+              </w:rPr>
+              <w:t>-0.2570</w:t>
+            </w:r>
+          </w:p>
+        </w:tc>
+        <w:tc>
+          <w:tcPr>
+            <w:tcW w:w="1413" w:type="dxa"/>
+            <w:tcBorders>
+              <w:top w:val="single" w:sz="6" w:space="0" w:color="666666"/>
+              <w:left w:val="none" w:sz="0" w:space="0" w:color="000000"/>
+              <w:bottom w:val="single" w:sz="6" w:space="0" w:color="666666"/>
+              <w:right w:val="none" w:sz="0" w:space="0" w:color="000000"/>
+            </w:tcBorders>
+            <w:shd w:val="clear" w:color="auto" w:fill="FFFFFF"/>
+            <w:tcMar>
+              <w:top w:w="0" w:type="dxa"/>
+              <w:left w:w="0" w:type="dxa"/>
+              <w:bottom w:w="0" w:type="dxa"/>
+              <w:right w:w="0" w:type="dxa"/>
+            </w:tcMar>
+            <w:vAlign w:val="center"/>
+          </w:tcPr>
+          <w:p>
+            <w:pPr>
+              <w:pBdr>
+                <w:top w:val="none" w:sz="0" w:space="0" w:color="000000"/>
+                <w:left w:val="none" w:sz="0" w:space="0" w:color="000000"/>
+                <w:bottom w:val="none" w:sz="0" w:space="0" w:color="000000"/>
+                <w:right w:val="none" w:sz="0" w:space="0" w:color="000000"/>
+              </w:pBdr>
+              <w:spacing w:before="100" w:after="100"/>
+              <w:ind w:left="100" w:right="100"/>
+              <w:jc w:val="center"/>
+              <w:rPr>
+                <w:rFonts w:eastAsia="Helvetica"/>
+                <w:color w:val="000000"/>
+              </w:rPr>
+            </w:pPr>
+            <w:r>
+              <w:rPr>
+                <w:rFonts w:eastAsia="Helvetica"/>
+                <w:color w:val="000000"/>
+              </w:rPr>
+              <w:t>0.2406</w:t>
+            </w:r>
+          </w:p>
+        </w:tc>
+        <w:tc>
+          <w:tcPr>
+            <w:tcW w:w="1206" w:type="dxa"/>
+            <w:tcBorders>
+              <w:top w:val="single" w:sz="6" w:space="0" w:color="666666"/>
+              <w:left w:val="none" w:sz="0" w:space="0" w:color="000000"/>
+              <w:bottom w:val="single" w:sz="6" w:space="0" w:color="666666"/>
+              <w:right w:val="none" w:sz="0" w:space="0" w:color="000000"/>
+            </w:tcBorders>
+            <w:shd w:val="clear" w:color="auto" w:fill="FFFFFF"/>
+            <w:tcMar>
+              <w:top w:w="0" w:type="dxa"/>
+              <w:left w:w="0" w:type="dxa"/>
+              <w:bottom w:w="0" w:type="dxa"/>
+              <w:right w:w="0" w:type="dxa"/>
+            </w:tcMar>
+            <w:vAlign w:val="center"/>
+          </w:tcPr>
+          <w:p>
+            <w:pPr>
+              <w:pBdr>
+                <w:top w:val="none" w:sz="0" w:space="0" w:color="000000"/>
+                <w:left w:val="none" w:sz="0" w:space="0" w:color="000000"/>
+                <w:bottom w:val="none" w:sz="0" w:space="0" w:color="000000"/>
+                <w:right w:val="none" w:sz="0" w:space="0" w:color="000000"/>
+              </w:pBdr>
+              <w:spacing w:before="100" w:after="100"/>
+              <w:ind w:left="100" w:right="100"/>
+              <w:jc w:val="center"/>
+              <w:rPr>
+                <w:rFonts w:eastAsia="Helvetica"/>
+                <w:color w:val="000000"/>
+              </w:rPr>
+            </w:pPr>
+            <w:r>
+              <w:rPr>
+                <w:rFonts w:eastAsia="Helvetica"/>
+                <w:color w:val="000000"/>
+              </w:rPr>
+              <w:t>-1.0681</w:t>
+            </w:r>
+          </w:p>
+        </w:tc>
+        <w:tc>
+          <w:tcPr>
+            <w:tcW w:w="1144" w:type="dxa"/>
+            <w:tcBorders>
+              <w:top w:val="single" w:sz="6" w:space="0" w:color="666666"/>
+              <w:left w:val="none" w:sz="0" w:space="0" w:color="000000"/>
+              <w:bottom w:val="single" w:sz="6" w:space="0" w:color="666666"/>
+              <w:right w:val="none" w:sz="0" w:space="0" w:color="000000"/>
+            </w:tcBorders>
+            <w:shd w:val="clear" w:color="auto" w:fill="FFFFFF"/>
+            <w:tcMar>
+              <w:top w:w="0" w:type="dxa"/>
+              <w:left w:w="0" w:type="dxa"/>
+              <w:bottom w:w="0" w:type="dxa"/>
+              <w:right w:w="0" w:type="dxa"/>
+            </w:tcMar>
+            <w:vAlign w:val="center"/>
+          </w:tcPr>
+          <w:p>
+            <w:pPr>
+              <w:pBdr>
+                <w:top w:val="none" w:sz="0" w:space="0" w:color="000000"/>
+                <w:left w:val="none" w:sz="0" w:space="0" w:color="000000"/>
+                <w:bottom w:val="none" w:sz="0" w:space="0" w:color="000000"/>
+                <w:right w:val="none" w:sz="0" w:space="0" w:color="000000"/>
+              </w:pBdr>
+              <w:spacing w:before="100" w:after="100"/>
+              <w:ind w:left="100" w:right="100"/>
+              <w:jc w:val="center"/>
+              <w:rPr>
+                <w:rFonts w:eastAsia="Helvetica"/>
+                <w:color w:val="000000"/>
+              </w:rPr>
+            </w:pPr>
+            <w:r>
+              <w:rPr>
+                <w:rFonts w:eastAsia="Helvetica"/>
+                <w:color w:val="000000"/>
+              </w:rPr>
+              <w:t>0.2878</w:t>
+            </w:r>
+          </w:p>
+        </w:tc>
+        <w:tc>
+          <w:tcPr>
+            <w:tcW w:w="1080" w:type="dxa"/>
+            <w:tcBorders>
+              <w:top w:val="single" w:sz="6" w:space="0" w:color="666666"/>
+              <w:left w:val="none" w:sz="0" w:space="0" w:color="000000"/>
+              <w:bottom w:val="single" w:sz="6" w:space="0" w:color="666666"/>
+              <w:right w:val="none" w:sz="0" w:space="0" w:color="000000"/>
+            </w:tcBorders>
+            <w:shd w:val="clear" w:color="auto" w:fill="FFFFFF"/>
+            <w:tcMar>
+              <w:top w:w="0" w:type="dxa"/>
+              <w:left w:w="0" w:type="dxa"/>
+              <w:bottom w:w="0" w:type="dxa"/>
+              <w:right w:w="0" w:type="dxa"/>
+            </w:tcMar>
+            <w:vAlign w:val="center"/>
+          </w:tcPr>
+          <w:p>
+            <w:pPr>
+              <w:pBdr>
+                <w:top w:val="none" w:sz="0" w:space="0" w:color="000000"/>
+                <w:left w:val="none" w:sz="0" w:space="0" w:color="000000"/>
+                <w:bottom w:val="none" w:sz="0" w:space="0" w:color="000000"/>
+                <w:right w:val="none" w:sz="0" w:space="0" w:color="000000"/>
+              </w:pBdr>
+              <w:spacing w:before="100" w:after="100"/>
+              <w:ind w:left="100" w:right="100"/>
+              <w:jc w:val="center"/>
+              <w:rPr>
+                <w:rFonts w:eastAsia="Helvetica"/>
+                <w:color w:val="000000"/>
+              </w:rPr>
+            </w:pPr>
+          </w:p>
+        </w:tc>
+      </w:tr>
+      <w:tr>
+        <w:trPr>
+          <w:jc w:val="center"/>
+        </w:trPr>
+        <w:tc>
+          <w:tcPr>
+            <w:tcW w:w="3309" w:type="dxa"/>
+            <w:tcBorders>
+              <w:top w:val="single" w:sz="6" w:space="0" w:color="666666"/>
+              <w:left w:val="none" w:sz="0" w:space="0" w:color="000000"/>
+              <w:bottom w:val="single" w:sz="6" w:space="0" w:color="666666"/>
+              <w:right w:val="none" w:sz="0" w:space="0" w:color="000000"/>
+            </w:tcBorders>
+            <w:shd w:val="clear" w:color="auto" w:fill="FFFFFF"/>
+            <w:tcMar>
+              <w:top w:w="0" w:type="dxa"/>
+              <w:left w:w="0" w:type="dxa"/>
+              <w:bottom w:w="0" w:type="dxa"/>
+              <w:right w:w="0" w:type="dxa"/>
+            </w:tcMar>
+            <w:vAlign w:val="center"/>
+          </w:tcPr>
+          <w:p>
+            <w:pPr>
+              <w:pBdr>
+                <w:top w:val="none" w:sz="0" w:space="0" w:color="000000"/>
+                <w:left w:val="none" w:sz="0" w:space="0" w:color="000000"/>
+                <w:bottom w:val="none" w:sz="0" w:space="0" w:color="000000"/>
+                <w:right w:val="none" w:sz="0" w:space="0" w:color="000000"/>
+              </w:pBdr>
+              <w:spacing w:before="100" w:after="100"/>
+              <w:ind w:left="100" w:right="100"/>
+              <w:rPr>
+                <w:rFonts w:eastAsia="Helvetica"/>
+                <w:color w:val="000000"/>
+              </w:rPr>
+            </w:pPr>
+            <w:r>
+              <w:rPr>
+                <w:rFonts w:eastAsia="Helvetica"/>
+                <w:color w:val="000000"/>
+              </w:rPr>
+              <w:lastRenderedPageBreak/>
+              <w:t>week_before_christmas</w:t>
+            </w:r>
+          </w:p>
+        </w:tc>
+        <w:tc>
+          <w:tcPr>
+            <w:tcW w:w="1596" w:type="dxa"/>
+            <w:tcBorders>
+              <w:top w:val="single" w:sz="6" w:space="0" w:color="666666"/>
+              <w:left w:val="none" w:sz="0" w:space="0" w:color="000000"/>
+              <w:bottom w:val="single" w:sz="6" w:space="0" w:color="666666"/>
+              <w:right w:val="none" w:sz="0" w:space="0" w:color="000000"/>
+            </w:tcBorders>
+            <w:shd w:val="clear" w:color="auto" w:fill="FFFFFF"/>
+            <w:tcMar>
+              <w:top w:w="0" w:type="dxa"/>
+              <w:left w:w="0" w:type="dxa"/>
+              <w:bottom w:w="0" w:type="dxa"/>
+              <w:right w:w="0" w:type="dxa"/>
+            </w:tcMar>
+            <w:vAlign w:val="center"/>
+          </w:tcPr>
+          <w:p>
+            <w:pPr>
+              <w:pBdr>
+                <w:top w:val="none" w:sz="0" w:space="0" w:color="000000"/>
+                <w:left w:val="none" w:sz="0" w:space="0" w:color="000000"/>
+                <w:bottom w:val="none" w:sz="0" w:space="0" w:color="000000"/>
+                <w:right w:val="none" w:sz="0" w:space="0" w:color="000000"/>
+              </w:pBdr>
+              <w:spacing w:before="100" w:after="100"/>
+              <w:ind w:left="100" w:right="100"/>
+              <w:jc w:val="center"/>
+              <w:rPr>
+                <w:rFonts w:eastAsia="Helvetica"/>
+                <w:color w:val="000000"/>
+              </w:rPr>
+            </w:pPr>
+            <w:r>
+              <w:rPr>
+                <w:rFonts w:eastAsia="Helvetica"/>
+                <w:color w:val="000000"/>
+              </w:rPr>
+              <w:t>0.0771</w:t>
+            </w:r>
+          </w:p>
+        </w:tc>
+        <w:tc>
+          <w:tcPr>
+            <w:tcW w:w="1413" w:type="dxa"/>
+            <w:tcBorders>
+              <w:top w:val="single" w:sz="6" w:space="0" w:color="666666"/>
+              <w:left w:val="none" w:sz="0" w:space="0" w:color="000000"/>
+              <w:bottom w:val="single" w:sz="6" w:space="0" w:color="666666"/>
+              <w:right w:val="none" w:sz="0" w:space="0" w:color="000000"/>
+            </w:tcBorders>
+            <w:shd w:val="clear" w:color="auto" w:fill="FFFFFF"/>
+            <w:tcMar>
+              <w:top w:w="0" w:type="dxa"/>
+              <w:left w:w="0" w:type="dxa"/>
+              <w:bottom w:w="0" w:type="dxa"/>
+              <w:right w:w="0" w:type="dxa"/>
+            </w:tcMar>
+            <w:vAlign w:val="center"/>
+          </w:tcPr>
+          <w:p>
+            <w:pPr>
+              <w:pBdr>
+                <w:top w:val="none" w:sz="0" w:space="0" w:color="000000"/>
+                <w:left w:val="none" w:sz="0" w:space="0" w:color="000000"/>
+                <w:bottom w:val="none" w:sz="0" w:space="0" w:color="000000"/>
+                <w:right w:val="none" w:sz="0" w:space="0" w:color="000000"/>
+              </w:pBdr>
+              <w:spacing w:before="100" w:after="100"/>
+              <w:ind w:left="100" w:right="100"/>
+              <w:jc w:val="center"/>
+              <w:rPr>
+                <w:rFonts w:eastAsia="Helvetica"/>
+                <w:color w:val="000000"/>
+              </w:rPr>
+            </w:pPr>
+            <w:r>
+              <w:rPr>
+                <w:rFonts w:eastAsia="Helvetica"/>
+                <w:color w:val="000000"/>
+              </w:rPr>
+              <w:t>0.2467</w:t>
+            </w:r>
+          </w:p>
+        </w:tc>
+        <w:tc>
+          <w:tcPr>
+            <w:tcW w:w="1206" w:type="dxa"/>
+            <w:tcBorders>
+              <w:top w:val="single" w:sz="6" w:space="0" w:color="666666"/>
+              <w:left w:val="none" w:sz="0" w:space="0" w:color="000000"/>
+              <w:bottom w:val="single" w:sz="6" w:space="0" w:color="666666"/>
+              <w:right w:val="none" w:sz="0" w:space="0" w:color="000000"/>
+            </w:tcBorders>
+            <w:shd w:val="clear" w:color="auto" w:fill="FFFFFF"/>
+            <w:tcMar>
+              <w:top w:w="0" w:type="dxa"/>
+              <w:left w:w="0" w:type="dxa"/>
+              <w:bottom w:w="0" w:type="dxa"/>
+              <w:right w:w="0" w:type="dxa"/>
+            </w:tcMar>
+            <w:vAlign w:val="center"/>
+          </w:tcPr>
+          <w:p>
+            <w:pPr>
+              <w:pBdr>
+                <w:top w:val="none" w:sz="0" w:space="0" w:color="000000"/>
+                <w:left w:val="none" w:sz="0" w:space="0" w:color="000000"/>
+                <w:bottom w:val="none" w:sz="0" w:space="0" w:color="000000"/>
+                <w:right w:val="none" w:sz="0" w:space="0" w:color="000000"/>
+              </w:pBdr>
+              <w:spacing w:before="100" w:after="100"/>
+              <w:ind w:left="100" w:right="100"/>
+              <w:jc w:val="center"/>
+              <w:rPr>
+                <w:rFonts w:eastAsia="Helvetica"/>
+                <w:color w:val="000000"/>
+              </w:rPr>
+            </w:pPr>
+            <w:r>
+              <w:rPr>
+                <w:rFonts w:eastAsia="Helvetica"/>
+                <w:color w:val="000000"/>
+              </w:rPr>
+              <w:t>0.3124</w:t>
+            </w:r>
+          </w:p>
+        </w:tc>
+        <w:tc>
+          <w:tcPr>
+            <w:tcW w:w="1144" w:type="dxa"/>
+            <w:tcBorders>
+              <w:top w:val="single" w:sz="6" w:space="0" w:color="666666"/>
+              <w:left w:val="none" w:sz="0" w:space="0" w:color="000000"/>
+              <w:bottom w:val="single" w:sz="6" w:space="0" w:color="666666"/>
+              <w:right w:val="none" w:sz="0" w:space="0" w:color="000000"/>
+            </w:tcBorders>
+            <w:shd w:val="clear" w:color="auto" w:fill="FFFFFF"/>
+            <w:tcMar>
+              <w:top w:w="0" w:type="dxa"/>
+              <w:left w:w="0" w:type="dxa"/>
+              <w:bottom w:w="0" w:type="dxa"/>
+              <w:right w:w="0" w:type="dxa"/>
+            </w:tcMar>
+            <w:vAlign w:val="center"/>
+          </w:tcPr>
+          <w:p>
+            <w:pPr>
+              <w:pBdr>
+                <w:top w:val="none" w:sz="0" w:space="0" w:color="000000"/>
+                <w:left w:val="none" w:sz="0" w:space="0" w:color="000000"/>
+                <w:bottom w:val="none" w:sz="0" w:space="0" w:color="000000"/>
+                <w:right w:val="none" w:sz="0" w:space="0" w:color="000000"/>
+              </w:pBdr>
+              <w:spacing w:before="100" w:after="100"/>
+              <w:ind w:left="100" w:right="100"/>
+              <w:jc w:val="center"/>
+              <w:rPr>
+                <w:rFonts w:eastAsia="Helvetica"/>
+                <w:color w:val="000000"/>
+              </w:rPr>
+            </w:pPr>
+            <w:r>
+              <w:rPr>
+                <w:rFonts w:eastAsia="Helvetica"/>
+                <w:color w:val="000000"/>
+              </w:rPr>
+              <w:t>0.7553</w:t>
+            </w:r>
+          </w:p>
+        </w:tc>
+        <w:tc>
+          <w:tcPr>
+            <w:tcW w:w="1080" w:type="dxa"/>
+            <w:tcBorders>
+              <w:top w:val="single" w:sz="6" w:space="0" w:color="666666"/>
+              <w:left w:val="none" w:sz="0" w:space="0" w:color="000000"/>
+              <w:bottom w:val="single" w:sz="6" w:space="0" w:color="666666"/>
+              <w:right w:val="none" w:sz="0" w:space="0" w:color="000000"/>
+            </w:tcBorders>
+            <w:shd w:val="clear" w:color="auto" w:fill="FFFFFF"/>
+            <w:tcMar>
+              <w:top w:w="0" w:type="dxa"/>
+              <w:left w:w="0" w:type="dxa"/>
+              <w:bottom w:w="0" w:type="dxa"/>
+              <w:right w:w="0" w:type="dxa"/>
+            </w:tcMar>
+            <w:vAlign w:val="center"/>
+          </w:tcPr>
+          <w:p>
+            <w:pPr>
+              <w:pBdr>
+                <w:top w:val="none" w:sz="0" w:space="0" w:color="000000"/>
+                <w:left w:val="none" w:sz="0" w:space="0" w:color="000000"/>
+                <w:bottom w:val="none" w:sz="0" w:space="0" w:color="000000"/>
+                <w:right w:val="none" w:sz="0" w:space="0" w:color="000000"/>
+              </w:pBdr>
+              <w:spacing w:before="100" w:after="100"/>
+              <w:ind w:left="100" w:right="100"/>
+              <w:jc w:val="center"/>
+              <w:rPr>
+                <w:rFonts w:eastAsia="Helvetica"/>
+                <w:color w:val="000000"/>
+              </w:rPr>
+            </w:pPr>
+          </w:p>
+        </w:tc>
+      </w:tr>
+      <w:tr>
+        <w:trPr>
+          <w:jc w:val="center"/>
+        </w:trPr>
+        <w:tc>
+          <w:tcPr>
+            <w:tcW w:w="3309" w:type="dxa"/>
+            <w:tcBorders>
+              <w:top w:val="single" w:sz="6" w:space="0" w:color="666666"/>
+              <w:left w:val="none" w:sz="0" w:space="0" w:color="000000"/>
+              <w:bottom w:val="single" w:sz="6" w:space="0" w:color="666666"/>
+              <w:right w:val="none" w:sz="0" w:space="0" w:color="000000"/>
+            </w:tcBorders>
+            <w:shd w:val="clear" w:color="auto" w:fill="FFFFFF"/>
+            <w:tcMar>
+              <w:top w:w="0" w:type="dxa"/>
+              <w:left w:w="0" w:type="dxa"/>
+              <w:bottom w:w="0" w:type="dxa"/>
+              <w:right w:w="0" w:type="dxa"/>
+            </w:tcMar>
+            <w:vAlign w:val="center"/>
+          </w:tcPr>
+          <w:p>
+            <w:pPr>
+              <w:pBdr>
+                <w:top w:val="none" w:sz="0" w:space="0" w:color="000000"/>
+                <w:left w:val="none" w:sz="0" w:space="0" w:color="000000"/>
+                <w:bottom w:val="none" w:sz="0" w:space="0" w:color="000000"/>
+                <w:right w:val="none" w:sz="0" w:space="0" w:color="000000"/>
+              </w:pBdr>
+              <w:spacing w:before="100" w:after="100"/>
+              <w:ind w:left="100" w:right="100"/>
+              <w:rPr>
+                <w:rFonts w:eastAsia="Helvetica"/>
+                <w:color w:val="000000"/>
+              </w:rPr>
+            </w:pPr>
+            <w:r>
+              <w:rPr>
+                <w:rFonts w:eastAsia="Helvetica"/>
+                <w:color w:val="000000"/>
+              </w:rPr>
+              <w:t>two_weeks_before_christmas</w:t>
+            </w:r>
+          </w:p>
+        </w:tc>
+        <w:tc>
+          <w:tcPr>
+            <w:tcW w:w="1596" w:type="dxa"/>
+            <w:tcBorders>
+              <w:top w:val="single" w:sz="6" w:space="0" w:color="666666"/>
+              <w:left w:val="none" w:sz="0" w:space="0" w:color="000000"/>
+              <w:bottom w:val="single" w:sz="6" w:space="0" w:color="666666"/>
+              <w:right w:val="none" w:sz="0" w:space="0" w:color="000000"/>
+            </w:tcBorders>
+            <w:shd w:val="clear" w:color="auto" w:fill="FFFFFF"/>
+            <w:tcMar>
+              <w:top w:w="0" w:type="dxa"/>
+              <w:left w:w="0" w:type="dxa"/>
+              <w:bottom w:w="0" w:type="dxa"/>
+              <w:right w:w="0" w:type="dxa"/>
+            </w:tcMar>
+            <w:vAlign w:val="center"/>
+          </w:tcPr>
+          <w:p>
+            <w:pPr>
+              <w:pBdr>
+                <w:top w:val="none" w:sz="0" w:space="0" w:color="000000"/>
+                <w:left w:val="none" w:sz="0" w:space="0" w:color="000000"/>
+                <w:bottom w:val="none" w:sz="0" w:space="0" w:color="000000"/>
+                <w:right w:val="none" w:sz="0" w:space="0" w:color="000000"/>
+              </w:pBdr>
+              <w:spacing w:before="100" w:after="100"/>
+              <w:ind w:left="100" w:right="100"/>
+              <w:jc w:val="center"/>
+              <w:rPr>
+                <w:rFonts w:eastAsia="Helvetica"/>
+                <w:color w:val="000000"/>
+              </w:rPr>
+            </w:pPr>
+            <w:r>
+              <w:rPr>
+                <w:rFonts w:eastAsia="Helvetica"/>
+                <w:color w:val="000000"/>
+              </w:rPr>
+              <w:t>0.0954</w:t>
+            </w:r>
+          </w:p>
+        </w:tc>
+        <w:tc>
+          <w:tcPr>
+            <w:tcW w:w="1413" w:type="dxa"/>
+            <w:tcBorders>
+              <w:top w:val="single" w:sz="6" w:space="0" w:color="666666"/>
+              <w:left w:val="none" w:sz="0" w:space="0" w:color="000000"/>
+              <w:bottom w:val="single" w:sz="6" w:space="0" w:color="666666"/>
+              <w:right w:val="none" w:sz="0" w:space="0" w:color="000000"/>
+            </w:tcBorders>
+            <w:shd w:val="clear" w:color="auto" w:fill="FFFFFF"/>
+            <w:tcMar>
+              <w:top w:w="0" w:type="dxa"/>
+              <w:left w:w="0" w:type="dxa"/>
+              <w:bottom w:w="0" w:type="dxa"/>
+              <w:right w:w="0" w:type="dxa"/>
+            </w:tcMar>
+            <w:vAlign w:val="center"/>
+          </w:tcPr>
+          <w:p>
+            <w:pPr>
+              <w:pBdr>
+                <w:top w:val="none" w:sz="0" w:space="0" w:color="000000"/>
+                <w:left w:val="none" w:sz="0" w:space="0" w:color="000000"/>
+                <w:bottom w:val="none" w:sz="0" w:space="0" w:color="000000"/>
+                <w:right w:val="none" w:sz="0" w:space="0" w:color="000000"/>
+              </w:pBdr>
+              <w:spacing w:before="100" w:after="100"/>
+              <w:ind w:left="100" w:right="100"/>
+              <w:jc w:val="center"/>
+              <w:rPr>
+                <w:rFonts w:eastAsia="Helvetica"/>
+                <w:color w:val="000000"/>
+              </w:rPr>
+            </w:pPr>
+            <w:r>
+              <w:rPr>
+                <w:rFonts w:eastAsia="Helvetica"/>
+                <w:color w:val="000000"/>
+              </w:rPr>
+              <w:t>0.2443</w:t>
+            </w:r>
+          </w:p>
+        </w:tc>
+        <w:tc>
+          <w:tcPr>
+            <w:tcW w:w="1206" w:type="dxa"/>
+            <w:tcBorders>
+              <w:top w:val="single" w:sz="6" w:space="0" w:color="666666"/>
+              <w:left w:val="none" w:sz="0" w:space="0" w:color="000000"/>
+              <w:bottom w:val="single" w:sz="6" w:space="0" w:color="666666"/>
+              <w:right w:val="none" w:sz="0" w:space="0" w:color="000000"/>
+            </w:tcBorders>
+            <w:shd w:val="clear" w:color="auto" w:fill="FFFFFF"/>
+            <w:tcMar>
+              <w:top w:w="0" w:type="dxa"/>
+              <w:left w:w="0" w:type="dxa"/>
+              <w:bottom w:w="0" w:type="dxa"/>
+              <w:right w:w="0" w:type="dxa"/>
+            </w:tcMar>
+            <w:vAlign w:val="center"/>
+          </w:tcPr>
+          <w:p>
+            <w:pPr>
+              <w:pBdr>
+                <w:top w:val="none" w:sz="0" w:space="0" w:color="000000"/>
+                <w:left w:val="none" w:sz="0" w:space="0" w:color="000000"/>
+                <w:bottom w:val="none" w:sz="0" w:space="0" w:color="000000"/>
+                <w:right w:val="none" w:sz="0" w:space="0" w:color="000000"/>
+              </w:pBdr>
+              <w:spacing w:before="100" w:after="100"/>
+              <w:ind w:left="100" w:right="100"/>
+              <w:jc w:val="center"/>
+              <w:rPr>
+                <w:rFonts w:eastAsia="Helvetica"/>
+                <w:color w:val="000000"/>
+              </w:rPr>
+            </w:pPr>
+            <w:r>
+              <w:rPr>
+                <w:rFonts w:eastAsia="Helvetica"/>
+                <w:color w:val="000000"/>
+              </w:rPr>
+              <w:t>0.3904</w:t>
+            </w:r>
+          </w:p>
+        </w:tc>
+        <w:tc>
+          <w:tcPr>
+            <w:tcW w:w="1144" w:type="dxa"/>
+            <w:tcBorders>
+              <w:top w:val="single" w:sz="6" w:space="0" w:color="666666"/>
+              <w:left w:val="none" w:sz="0" w:space="0" w:color="000000"/>
+              <w:bottom w:val="single" w:sz="6" w:space="0" w:color="666666"/>
+              <w:right w:val="none" w:sz="0" w:space="0" w:color="000000"/>
+            </w:tcBorders>
+            <w:shd w:val="clear" w:color="auto" w:fill="FFFFFF"/>
+            <w:tcMar>
+              <w:top w:w="0" w:type="dxa"/>
+              <w:left w:w="0" w:type="dxa"/>
+              <w:bottom w:w="0" w:type="dxa"/>
+              <w:right w:w="0" w:type="dxa"/>
+            </w:tcMar>
+            <w:vAlign w:val="center"/>
+          </w:tcPr>
+          <w:p>
+            <w:pPr>
+              <w:pBdr>
+                <w:top w:val="none" w:sz="0" w:space="0" w:color="000000"/>
+                <w:left w:val="none" w:sz="0" w:space="0" w:color="000000"/>
+                <w:bottom w:val="none" w:sz="0" w:space="0" w:color="000000"/>
+                <w:right w:val="none" w:sz="0" w:space="0" w:color="000000"/>
+              </w:pBdr>
+              <w:spacing w:before="100" w:after="100"/>
+              <w:ind w:left="100" w:right="100"/>
+              <w:jc w:val="center"/>
+              <w:rPr>
+                <w:rFonts w:eastAsia="Helvetica"/>
+                <w:color w:val="000000"/>
+              </w:rPr>
+            </w:pPr>
+            <w:r>
+              <w:rPr>
+                <w:rFonts w:eastAsia="Helvetica"/>
+                <w:color w:val="000000"/>
+              </w:rPr>
+              <w:t>0.6970</w:t>
+            </w:r>
+          </w:p>
+        </w:tc>
+        <w:tc>
+          <w:tcPr>
+            <w:tcW w:w="1080" w:type="dxa"/>
+            <w:tcBorders>
+              <w:top w:val="single" w:sz="6" w:space="0" w:color="666666"/>
+              <w:left w:val="none" w:sz="0" w:space="0" w:color="000000"/>
+              <w:bottom w:val="single" w:sz="6" w:space="0" w:color="666666"/>
+              <w:right w:val="none" w:sz="0" w:space="0" w:color="000000"/>
+            </w:tcBorders>
+            <w:shd w:val="clear" w:color="auto" w:fill="FFFFFF"/>
+            <w:tcMar>
+              <w:top w:w="0" w:type="dxa"/>
+              <w:left w:w="0" w:type="dxa"/>
+              <w:bottom w:w="0" w:type="dxa"/>
+              <w:right w:w="0" w:type="dxa"/>
+            </w:tcMar>
+            <w:vAlign w:val="center"/>
+          </w:tcPr>
+          <w:p>
+            <w:pPr>
+              <w:pBdr>
+                <w:top w:val="none" w:sz="0" w:space="0" w:color="000000"/>
+                <w:left w:val="none" w:sz="0" w:space="0" w:color="000000"/>
+                <w:bottom w:val="none" w:sz="0" w:space="0" w:color="000000"/>
+                <w:right w:val="none" w:sz="0" w:space="0" w:color="000000"/>
+              </w:pBdr>
+              <w:spacing w:before="100" w:after="100"/>
+              <w:ind w:left="100" w:right="100"/>
+              <w:jc w:val="center"/>
+              <w:rPr>
+                <w:rFonts w:eastAsia="Helvetica"/>
+                <w:color w:val="000000"/>
+              </w:rPr>
+            </w:pPr>
+          </w:p>
+        </w:tc>
+      </w:tr>
+      <w:tr>
+        <w:trPr>
+          <w:jc w:val="center"/>
+        </w:trPr>
+        <w:tc>
+          <w:tcPr>
+            <w:tcW w:w="3309" w:type="dxa"/>
+            <w:tcBorders>
+              <w:top w:val="single" w:sz="6" w:space="0" w:color="666666"/>
+              <w:left w:val="none" w:sz="0" w:space="0" w:color="000000"/>
+              <w:bottom w:val="single" w:sz="6" w:space="0" w:color="666666"/>
+              <w:right w:val="none" w:sz="0" w:space="0" w:color="000000"/>
+            </w:tcBorders>
+            <w:shd w:val="clear" w:color="auto" w:fill="FFFFFF"/>
+            <w:tcMar>
+              <w:top w:w="0" w:type="dxa"/>
+              <w:left w:w="0" w:type="dxa"/>
+              <w:bottom w:w="0" w:type="dxa"/>
+              <w:right w:w="0" w:type="dxa"/>
+            </w:tcMar>
+            <w:vAlign w:val="center"/>
+          </w:tcPr>
+          <w:p>
+            <w:pPr>
+              <w:pBdr>
+                <w:top w:val="none" w:sz="0" w:space="0" w:color="000000"/>
+                <w:left w:val="none" w:sz="0" w:space="0" w:color="000000"/>
+                <w:bottom w:val="none" w:sz="0" w:space="0" w:color="000000"/>
+                <w:right w:val="none" w:sz="0" w:space="0" w:color="000000"/>
+              </w:pBdr>
+              <w:spacing w:before="100" w:after="100"/>
+              <w:ind w:left="100" w:right="100"/>
+              <w:rPr>
+                <w:rFonts w:eastAsia="Helvetica"/>
+                <w:color w:val="000000"/>
+              </w:rPr>
+            </w:pPr>
+            <w:r>
+              <w:rPr>
+                <w:rFonts w:eastAsia="Helvetica"/>
+                <w:color w:val="000000"/>
+              </w:rPr>
+              <w:t>temporada_alta</w:t>
+            </w:r>
+          </w:p>
+        </w:tc>
+        <w:tc>
+          <w:tcPr>
+            <w:tcW w:w="1596" w:type="dxa"/>
+            <w:tcBorders>
+              <w:top w:val="single" w:sz="6" w:space="0" w:color="666666"/>
+              <w:left w:val="none" w:sz="0" w:space="0" w:color="000000"/>
+              <w:bottom w:val="single" w:sz="6" w:space="0" w:color="666666"/>
+              <w:right w:val="none" w:sz="0" w:space="0" w:color="000000"/>
+            </w:tcBorders>
+            <w:shd w:val="clear" w:color="auto" w:fill="FFFFFF"/>
+            <w:tcMar>
+              <w:top w:w="0" w:type="dxa"/>
+              <w:left w:w="0" w:type="dxa"/>
+              <w:bottom w:w="0" w:type="dxa"/>
+              <w:right w:w="0" w:type="dxa"/>
+            </w:tcMar>
+            <w:vAlign w:val="center"/>
+          </w:tcPr>
+          <w:p>
+            <w:pPr>
+              <w:pBdr>
+                <w:top w:val="none" w:sz="0" w:space="0" w:color="000000"/>
+                <w:left w:val="none" w:sz="0" w:space="0" w:color="000000"/>
+                <w:bottom w:val="none" w:sz="0" w:space="0" w:color="000000"/>
+                <w:right w:val="none" w:sz="0" w:space="0" w:color="000000"/>
+              </w:pBdr>
+              <w:spacing w:before="100" w:after="100"/>
+              <w:ind w:left="100" w:right="100"/>
+              <w:jc w:val="center"/>
+              <w:rPr>
+                <w:rFonts w:eastAsia="Helvetica"/>
+                <w:color w:val="000000"/>
+              </w:rPr>
+            </w:pPr>
+            <w:r>
+              <w:rPr>
+                <w:rFonts w:eastAsia="Helvetica"/>
+                <w:color w:val="000000"/>
+              </w:rPr>
+              <w:t>0.1012</w:t>
+            </w:r>
+          </w:p>
+        </w:tc>
+        <w:tc>
+          <w:tcPr>
+            <w:tcW w:w="1413" w:type="dxa"/>
+            <w:tcBorders>
+              <w:top w:val="single" w:sz="6" w:space="0" w:color="666666"/>
+              <w:left w:val="none" w:sz="0" w:space="0" w:color="000000"/>
+              <w:bottom w:val="single" w:sz="6" w:space="0" w:color="666666"/>
+              <w:right w:val="none" w:sz="0" w:space="0" w:color="000000"/>
+            </w:tcBorders>
+            <w:shd w:val="clear" w:color="auto" w:fill="FFFFFF"/>
+            <w:tcMar>
+              <w:top w:w="0" w:type="dxa"/>
+              <w:left w:w="0" w:type="dxa"/>
+              <w:bottom w:w="0" w:type="dxa"/>
+              <w:right w:w="0" w:type="dxa"/>
+            </w:tcMar>
+            <w:vAlign w:val="center"/>
+          </w:tcPr>
+          <w:p>
+            <w:pPr>
+              <w:pBdr>
+                <w:top w:val="none" w:sz="0" w:space="0" w:color="000000"/>
+                <w:left w:val="none" w:sz="0" w:space="0" w:color="000000"/>
+                <w:bottom w:val="none" w:sz="0" w:space="0" w:color="000000"/>
+                <w:right w:val="none" w:sz="0" w:space="0" w:color="000000"/>
+              </w:pBdr>
+              <w:spacing w:before="100" w:after="100"/>
+              <w:ind w:left="100" w:right="100"/>
+              <w:jc w:val="center"/>
+              <w:rPr>
+                <w:rFonts w:eastAsia="Helvetica"/>
+                <w:color w:val="000000"/>
+              </w:rPr>
+            </w:pPr>
+            <w:r>
+              <w:rPr>
+                <w:rFonts w:eastAsia="Helvetica"/>
+                <w:color w:val="000000"/>
+              </w:rPr>
+              <w:t>0.0739</w:t>
+            </w:r>
+          </w:p>
+        </w:tc>
+        <w:tc>
+          <w:tcPr>
+            <w:tcW w:w="1206" w:type="dxa"/>
+            <w:tcBorders>
+              <w:top w:val="single" w:sz="6" w:space="0" w:color="666666"/>
+              <w:left w:val="none" w:sz="0" w:space="0" w:color="000000"/>
+              <w:bottom w:val="single" w:sz="6" w:space="0" w:color="666666"/>
+              <w:right w:val="none" w:sz="0" w:space="0" w:color="000000"/>
+            </w:tcBorders>
+            <w:shd w:val="clear" w:color="auto" w:fill="FFFFFF"/>
+            <w:tcMar>
+              <w:top w:w="0" w:type="dxa"/>
+              <w:left w:w="0" w:type="dxa"/>
+              <w:bottom w:w="0" w:type="dxa"/>
+              <w:right w:w="0" w:type="dxa"/>
+            </w:tcMar>
+            <w:vAlign w:val="center"/>
+          </w:tcPr>
+          <w:p>
+            <w:pPr>
+              <w:pBdr>
+                <w:top w:val="none" w:sz="0" w:space="0" w:color="000000"/>
+                <w:left w:val="none" w:sz="0" w:space="0" w:color="000000"/>
+                <w:bottom w:val="none" w:sz="0" w:space="0" w:color="000000"/>
+                <w:right w:val="none" w:sz="0" w:space="0" w:color="000000"/>
+              </w:pBdr>
+              <w:spacing w:before="100" w:after="100"/>
+              <w:ind w:left="100" w:right="100"/>
+              <w:jc w:val="center"/>
+              <w:rPr>
+                <w:rFonts w:eastAsia="Helvetica"/>
+                <w:color w:val="000000"/>
+              </w:rPr>
+            </w:pPr>
+            <w:r>
+              <w:rPr>
+                <w:rFonts w:eastAsia="Helvetica"/>
+                <w:color w:val="000000"/>
+              </w:rPr>
+              <w:t>1.3695</w:t>
+            </w:r>
+          </w:p>
+        </w:tc>
+        <w:tc>
+          <w:tcPr>
+            <w:tcW w:w="1144" w:type="dxa"/>
+            <w:tcBorders>
+              <w:top w:val="single" w:sz="6" w:space="0" w:color="666666"/>
+              <w:left w:val="none" w:sz="0" w:space="0" w:color="000000"/>
+              <w:bottom w:val="single" w:sz="6" w:space="0" w:color="666666"/>
+              <w:right w:val="none" w:sz="0" w:space="0" w:color="000000"/>
+            </w:tcBorders>
+            <w:shd w:val="clear" w:color="auto" w:fill="FFFFFF"/>
+            <w:tcMar>
+              <w:top w:w="0" w:type="dxa"/>
+              <w:left w:w="0" w:type="dxa"/>
+              <w:bottom w:w="0" w:type="dxa"/>
+              <w:right w:w="0" w:type="dxa"/>
+            </w:tcMar>
+            <w:vAlign w:val="center"/>
+          </w:tcPr>
+          <w:p>
+            <w:pPr>
+              <w:pBdr>
+                <w:top w:val="none" w:sz="0" w:space="0" w:color="000000"/>
+                <w:left w:val="none" w:sz="0" w:space="0" w:color="000000"/>
+                <w:bottom w:val="none" w:sz="0" w:space="0" w:color="000000"/>
+                <w:right w:val="none" w:sz="0" w:space="0" w:color="000000"/>
+              </w:pBdr>
+              <w:spacing w:before="100" w:after="100"/>
+              <w:ind w:left="100" w:right="100"/>
+              <w:jc w:val="center"/>
+              <w:rPr>
+                <w:rFonts w:eastAsia="Helvetica"/>
+                <w:color w:val="000000"/>
+              </w:rPr>
+            </w:pPr>
+            <w:r>
+              <w:rPr>
+                <w:rFonts w:eastAsia="Helvetica"/>
+                <w:color w:val="000000"/>
+              </w:rPr>
+              <w:t>0.1736</w:t>
+            </w:r>
+          </w:p>
+        </w:tc>
+        <w:tc>
+          <w:tcPr>
+            <w:tcW w:w="1080" w:type="dxa"/>
+            <w:tcBorders>
+              <w:top w:val="single" w:sz="6" w:space="0" w:color="666666"/>
+              <w:left w:val="none" w:sz="0" w:space="0" w:color="000000"/>
+              <w:bottom w:val="single" w:sz="6" w:space="0" w:color="666666"/>
+              <w:right w:val="none" w:sz="0" w:space="0" w:color="000000"/>
+            </w:tcBorders>
+            <w:shd w:val="clear" w:color="auto" w:fill="FFFFFF"/>
+            <w:tcMar>
+              <w:top w:w="0" w:type="dxa"/>
+              <w:left w:w="0" w:type="dxa"/>
+              <w:bottom w:w="0" w:type="dxa"/>
+              <w:right w:w="0" w:type="dxa"/>
+            </w:tcMar>
+            <w:vAlign w:val="center"/>
+          </w:tcPr>
+          <w:p>
+            <w:pPr>
+              <w:pBdr>
+                <w:top w:val="none" w:sz="0" w:space="0" w:color="000000"/>
+                <w:left w:val="none" w:sz="0" w:space="0" w:color="000000"/>
+                <w:bottom w:val="none" w:sz="0" w:space="0" w:color="000000"/>
+                <w:right w:val="none" w:sz="0" w:space="0" w:color="000000"/>
+              </w:pBdr>
+              <w:spacing w:before="100" w:after="100"/>
+              <w:ind w:left="100" w:right="100"/>
+              <w:jc w:val="center"/>
+              <w:rPr>
+                <w:rFonts w:eastAsia="Helvetica"/>
+                <w:color w:val="000000"/>
+              </w:rPr>
+            </w:pPr>
+          </w:p>
+        </w:tc>
+      </w:tr>
+      <w:tr>
+        <w:trPr>
+          <w:jc w:val="center"/>
+        </w:trPr>
+        <w:tc>
+          <w:tcPr>
+            <w:tcW w:w="3309" w:type="dxa"/>
+            <w:tcBorders>
+              <w:top w:val="single" w:sz="6" w:space="0" w:color="666666"/>
+              <w:left w:val="none" w:sz="0" w:space="0" w:color="000000"/>
+              <w:bottom w:val="single" w:sz="6" w:space="0" w:color="666666"/>
+              <w:right w:val="none" w:sz="0" w:space="0" w:color="000000"/>
+            </w:tcBorders>
+            <w:shd w:val="clear" w:color="auto" w:fill="FFFFFF"/>
+            <w:tcMar>
+              <w:top w:w="0" w:type="dxa"/>
+              <w:left w:w="0" w:type="dxa"/>
+              <w:bottom w:w="0" w:type="dxa"/>
+              <w:right w:w="0" w:type="dxa"/>
+            </w:tcMar>
+            <w:vAlign w:val="center"/>
+          </w:tcPr>
+          <w:p>
+            <w:pPr>
+              <w:pBdr>
+                <w:top w:val="none" w:sz="0" w:space="0" w:color="000000"/>
+                <w:left w:val="none" w:sz="0" w:space="0" w:color="000000"/>
+                <w:bottom w:val="none" w:sz="0" w:space="0" w:color="000000"/>
+                <w:right w:val="none" w:sz="0" w:space="0" w:color="000000"/>
+              </w:pBdr>
+              <w:spacing w:before="100" w:after="100"/>
+              <w:ind w:left="100" w:right="100"/>
+              <w:rPr>
+                <w:rFonts w:eastAsia="Helvetica"/>
+                <w:color w:val="000000"/>
+              </w:rPr>
+            </w:pPr>
+            <w:r>
+              <w:rPr>
+                <w:rFonts w:eastAsia="Helvetica"/>
+                <w:color w:val="000000"/>
+              </w:rPr>
+              <w:t>R²</w:t>
+            </w:r>
+          </w:p>
+        </w:tc>
+        <w:tc>
+          <w:tcPr>
+            <w:tcW w:w="1596" w:type="dxa"/>
+            <w:tcBorders>
+              <w:top w:val="single" w:sz="6" w:space="0" w:color="666666"/>
+              <w:left w:val="none" w:sz="0" w:space="0" w:color="000000"/>
+              <w:bottom w:val="single" w:sz="6" w:space="0" w:color="666666"/>
+              <w:right w:val="none" w:sz="0" w:space="0" w:color="000000"/>
+            </w:tcBorders>
+            <w:shd w:val="clear" w:color="auto" w:fill="FFFFFF"/>
+            <w:tcMar>
+              <w:top w:w="0" w:type="dxa"/>
+              <w:left w:w="0" w:type="dxa"/>
+              <w:bottom w:w="0" w:type="dxa"/>
+              <w:right w:w="0" w:type="dxa"/>
+            </w:tcMar>
+            <w:vAlign w:val="center"/>
+          </w:tcPr>
+          <w:p>
+            <w:pPr>
+              <w:pBdr>
+                <w:top w:val="none" w:sz="0" w:space="0" w:color="000000"/>
+                <w:left w:val="none" w:sz="0" w:space="0" w:color="000000"/>
+                <w:bottom w:val="none" w:sz="0" w:space="0" w:color="000000"/>
+                <w:right w:val="none" w:sz="0" w:space="0" w:color="000000"/>
+              </w:pBdr>
+              <w:spacing w:before="100" w:after="100"/>
+              <w:ind w:left="100" w:right="100"/>
+              <w:jc w:val="center"/>
+              <w:rPr>
+                <w:rFonts w:eastAsia="Helvetica"/>
+                <w:color w:val="000000"/>
+              </w:rPr>
+            </w:pPr>
+            <w:r>
+              <w:rPr>
+                <w:rFonts w:eastAsia="Helvetica"/>
+                <w:color w:val="000000"/>
+              </w:rPr>
+              <w:t>0.4159</w:t>
+            </w:r>
+          </w:p>
+        </w:tc>
+        <w:tc>
+          <w:tcPr>
+            <w:tcW w:w="1413" w:type="dxa"/>
+            <w:tcBorders>
+              <w:top w:val="single" w:sz="6" w:space="0" w:color="666666"/>
+              <w:left w:val="none" w:sz="0" w:space="0" w:color="000000"/>
+              <w:bottom w:val="single" w:sz="6" w:space="0" w:color="666666"/>
+              <w:right w:val="none" w:sz="0" w:space="0" w:color="000000"/>
+            </w:tcBorders>
+            <w:shd w:val="clear" w:color="auto" w:fill="FFFFFF"/>
+            <w:tcMar>
+              <w:top w:w="0" w:type="dxa"/>
+              <w:left w:w="0" w:type="dxa"/>
+              <w:bottom w:w="0" w:type="dxa"/>
+              <w:right w:w="0" w:type="dxa"/>
+            </w:tcMar>
+            <w:vAlign w:val="center"/>
+          </w:tcPr>
+          <w:p>
+            <w:pPr>
+              <w:pBdr>
+                <w:top w:val="none" w:sz="0" w:space="0" w:color="000000"/>
+                <w:left w:val="none" w:sz="0" w:space="0" w:color="000000"/>
+                <w:bottom w:val="none" w:sz="0" w:space="0" w:color="000000"/>
+                <w:right w:val="none" w:sz="0" w:space="0" w:color="000000"/>
+              </w:pBdr>
+              <w:spacing w:before="100" w:after="100"/>
+              <w:ind w:left="100" w:right="100"/>
+              <w:jc w:val="center"/>
+              <w:rPr>
+                <w:rFonts w:eastAsia="Helvetica"/>
+                <w:color w:val="000000"/>
+              </w:rPr>
+            </w:pPr>
+          </w:p>
+        </w:tc>
+        <w:tc>
+          <w:tcPr>
+            <w:tcW w:w="1206" w:type="dxa"/>
+            <w:tcBorders>
+              <w:top w:val="single" w:sz="6" w:space="0" w:color="666666"/>
+              <w:left w:val="none" w:sz="0" w:space="0" w:color="000000"/>
+              <w:bottom w:val="single" w:sz="6" w:space="0" w:color="666666"/>
+              <w:right w:val="none" w:sz="0" w:space="0" w:color="000000"/>
+            </w:tcBorders>
+            <w:shd w:val="clear" w:color="auto" w:fill="FFFFFF"/>
+            <w:tcMar>
+              <w:top w:w="0" w:type="dxa"/>
+              <w:left w:w="0" w:type="dxa"/>
+              <w:bottom w:w="0" w:type="dxa"/>
+              <w:right w:w="0" w:type="dxa"/>
+            </w:tcMar>
+            <w:vAlign w:val="center"/>
+          </w:tcPr>
+          <w:p>
+            <w:pPr>
+              <w:pBdr>
+                <w:top w:val="none" w:sz="0" w:space="0" w:color="000000"/>
+                <w:left w:val="none" w:sz="0" w:space="0" w:color="000000"/>
+                <w:bottom w:val="none" w:sz="0" w:space="0" w:color="000000"/>
+                <w:right w:val="none" w:sz="0" w:space="0" w:color="000000"/>
+              </w:pBdr>
+              <w:spacing w:before="100" w:after="100"/>
+              <w:ind w:left="100" w:right="100"/>
+              <w:jc w:val="center"/>
+              <w:rPr>
+                <w:rFonts w:eastAsia="Helvetica"/>
+                <w:color w:val="000000"/>
+              </w:rPr>
+            </w:pPr>
+          </w:p>
+        </w:tc>
+        <w:tc>
+          <w:tcPr>
+            <w:tcW w:w="1144" w:type="dxa"/>
+            <w:tcBorders>
+              <w:top w:val="single" w:sz="6" w:space="0" w:color="666666"/>
+              <w:left w:val="none" w:sz="0" w:space="0" w:color="000000"/>
+              <w:bottom w:val="single" w:sz="6" w:space="0" w:color="666666"/>
+              <w:right w:val="none" w:sz="0" w:space="0" w:color="000000"/>
+            </w:tcBorders>
+            <w:shd w:val="clear" w:color="auto" w:fill="FFFFFF"/>
+            <w:tcMar>
+              <w:top w:w="0" w:type="dxa"/>
+              <w:left w:w="0" w:type="dxa"/>
+              <w:bottom w:w="0" w:type="dxa"/>
+              <w:right w:w="0" w:type="dxa"/>
+            </w:tcMar>
+            <w:vAlign w:val="center"/>
+          </w:tcPr>
+          <w:p>
+            <w:pPr>
+              <w:pBdr>
+                <w:top w:val="none" w:sz="0" w:space="0" w:color="000000"/>
+                <w:left w:val="none" w:sz="0" w:space="0" w:color="000000"/>
+                <w:bottom w:val="none" w:sz="0" w:space="0" w:color="000000"/>
+                <w:right w:val="none" w:sz="0" w:space="0" w:color="000000"/>
+              </w:pBdr>
+              <w:spacing w:before="100" w:after="100"/>
+              <w:ind w:left="100" w:right="100"/>
+              <w:jc w:val="center"/>
+              <w:rPr>
+                <w:rFonts w:eastAsia="Helvetica"/>
+                <w:color w:val="000000"/>
+              </w:rPr>
+            </w:pPr>
+          </w:p>
+        </w:tc>
+        <w:tc>
+          <w:tcPr>
+            <w:tcW w:w="1080" w:type="dxa"/>
+            <w:tcBorders>
+              <w:top w:val="single" w:sz="6" w:space="0" w:color="666666"/>
+              <w:left w:val="none" w:sz="0" w:space="0" w:color="000000"/>
+              <w:bottom w:val="single" w:sz="6" w:space="0" w:color="666666"/>
+              <w:right w:val="none" w:sz="0" w:space="0" w:color="000000"/>
+            </w:tcBorders>
+            <w:shd w:val="clear" w:color="auto" w:fill="FFFFFF"/>
+            <w:tcMar>
+              <w:top w:w="0" w:type="dxa"/>
+              <w:left w:w="0" w:type="dxa"/>
+              <w:bottom w:w="0" w:type="dxa"/>
+              <w:right w:w="0" w:type="dxa"/>
+            </w:tcMar>
+            <w:vAlign w:val="center"/>
+          </w:tcPr>
+          <w:p>
+            <w:pPr>
+              <w:pBdr>
+                <w:top w:val="none" w:sz="0" w:space="0" w:color="000000"/>
+                <w:left w:val="none" w:sz="0" w:space="0" w:color="000000"/>
+                <w:bottom w:val="none" w:sz="0" w:space="0" w:color="000000"/>
+                <w:right w:val="none" w:sz="0" w:space="0" w:color="000000"/>
+              </w:pBdr>
+              <w:spacing w:before="100" w:after="100"/>
+              <w:ind w:left="100" w:right="100"/>
+              <w:jc w:val="center"/>
+              <w:rPr>
+                <w:rFonts w:eastAsia="Helvetica"/>
+                <w:color w:val="000000"/>
+              </w:rPr>
+            </w:pPr>
+          </w:p>
+        </w:tc>
+      </w:tr>
+      <w:tr>
+        <w:trPr>
+          <w:jc w:val="center"/>
+        </w:trPr>
+        <w:tc>
+          <w:tcPr>
+            <w:tcW w:w="3309" w:type="dxa"/>
+            <w:tcBorders>
+              <w:top w:val="single" w:sz="6" w:space="0" w:color="666666"/>
+              <w:left w:val="none" w:sz="0" w:space="0" w:color="000000"/>
+              <w:bottom w:val="single" w:sz="12" w:space="0" w:color="666666"/>
+              <w:right w:val="none" w:sz="0" w:space="0" w:color="000000"/>
+            </w:tcBorders>
+            <w:shd w:val="clear" w:color="auto" w:fill="FFFFFF"/>
+            <w:tcMar>
+              <w:top w:w="0" w:type="dxa"/>
+              <w:left w:w="0" w:type="dxa"/>
+              <w:bottom w:w="0" w:type="dxa"/>
+              <w:right w:w="0" w:type="dxa"/>
+            </w:tcMar>
+            <w:vAlign w:val="center"/>
+          </w:tcPr>
+          <w:p>
+            <w:pPr>
+              <w:pBdr>
+                <w:top w:val="none" w:sz="0" w:space="0" w:color="000000"/>
+                <w:left w:val="none" w:sz="0" w:space="0" w:color="000000"/>
+                <w:bottom w:val="none" w:sz="0" w:space="0" w:color="000000"/>
+                <w:right w:val="none" w:sz="0" w:space="0" w:color="000000"/>
+              </w:pBdr>
+              <w:spacing w:before="100" w:after="100"/>
+              <w:ind w:left="100" w:right="100"/>
+              <w:rPr>
+                <w:rFonts w:eastAsia="Helvetica"/>
+                <w:color w:val="000000"/>
+              </w:rPr>
+            </w:pPr>
+            <w:r>
+              <w:rPr>
+                <w:rFonts w:eastAsia="Helvetica"/>
+                <w:color w:val="000000"/>
+              </w:rPr>
+              <w:t>R² Adj.</w:t>
+            </w:r>
+          </w:p>
+        </w:tc>
+        <w:tc>
+          <w:tcPr>
+            <w:tcW w:w="1596" w:type="dxa"/>
+            <w:tcBorders>
+              <w:top w:val="single" w:sz="6" w:space="0" w:color="666666"/>
+              <w:left w:val="none" w:sz="0" w:space="0" w:color="000000"/>
+              <w:bottom w:val="single" w:sz="12" w:space="0" w:color="666666"/>
+              <w:right w:val="none" w:sz="0" w:space="0" w:color="000000"/>
+            </w:tcBorders>
+            <w:shd w:val="clear" w:color="auto" w:fill="FFFFFF"/>
+            <w:tcMar>
+              <w:top w:w="0" w:type="dxa"/>
+              <w:left w:w="0" w:type="dxa"/>
+              <w:bottom w:w="0" w:type="dxa"/>
+              <w:right w:w="0" w:type="dxa"/>
+            </w:tcMar>
+            <w:vAlign w:val="center"/>
+          </w:tcPr>
+          <w:p>
+            <w:pPr>
+              <w:pBdr>
+                <w:top w:val="none" w:sz="0" w:space="0" w:color="000000"/>
+                <w:left w:val="none" w:sz="0" w:space="0" w:color="000000"/>
+                <w:bottom w:val="none" w:sz="0" w:space="0" w:color="000000"/>
+                <w:right w:val="none" w:sz="0" w:space="0" w:color="000000"/>
+              </w:pBdr>
+              <w:spacing w:before="100" w:after="100"/>
+              <w:ind w:left="100" w:right="100"/>
+              <w:jc w:val="center"/>
+              <w:rPr>
+                <w:rFonts w:eastAsia="Helvetica"/>
+                <w:color w:val="000000"/>
+              </w:rPr>
+            </w:pPr>
+            <w:r>
+              <w:rPr>
+                <w:rFonts w:eastAsia="Helvetica"/>
+                <w:color w:val="000000"/>
+              </w:rPr>
+              <w:t>0.3735</w:t>
+            </w:r>
+          </w:p>
+        </w:tc>
+        <w:tc>
+          <w:tcPr>
+            <w:tcW w:w="1413" w:type="dxa"/>
+            <w:tcBorders>
+              <w:top w:val="single" w:sz="6" w:space="0" w:color="666666"/>
+              <w:left w:val="none" w:sz="0" w:space="0" w:color="000000"/>
+              <w:bottom w:val="single" w:sz="12" w:space="0" w:color="666666"/>
+              <w:right w:val="none" w:sz="0" w:space="0" w:color="000000"/>
+            </w:tcBorders>
+            <w:shd w:val="clear" w:color="auto" w:fill="FFFFFF"/>
+            <w:tcMar>
+              <w:top w:w="0" w:type="dxa"/>
+              <w:left w:w="0" w:type="dxa"/>
+              <w:bottom w:w="0" w:type="dxa"/>
+              <w:right w:w="0" w:type="dxa"/>
+            </w:tcMar>
+            <w:vAlign w:val="center"/>
+          </w:tcPr>
+          <w:p>
+            <w:pPr>
+              <w:pBdr>
+                <w:top w:val="none" w:sz="0" w:space="0" w:color="000000"/>
+                <w:left w:val="none" w:sz="0" w:space="0" w:color="000000"/>
+                <w:bottom w:val="none" w:sz="0" w:space="0" w:color="000000"/>
+                <w:right w:val="none" w:sz="0" w:space="0" w:color="000000"/>
+              </w:pBdr>
+              <w:spacing w:before="100" w:after="100"/>
+              <w:ind w:left="100" w:right="100"/>
+              <w:jc w:val="center"/>
+              <w:rPr>
+                <w:rFonts w:eastAsia="Helvetica"/>
+                <w:color w:val="000000"/>
+              </w:rPr>
+            </w:pPr>
+          </w:p>
+        </w:tc>
+        <w:tc>
+          <w:tcPr>
+            <w:tcW w:w="1206" w:type="dxa"/>
+            <w:tcBorders>
+              <w:top w:val="single" w:sz="6" w:space="0" w:color="666666"/>
+              <w:left w:val="none" w:sz="0" w:space="0" w:color="000000"/>
+              <w:bottom w:val="single" w:sz="12" w:space="0" w:color="666666"/>
+              <w:right w:val="none" w:sz="0" w:space="0" w:color="000000"/>
+            </w:tcBorders>
+            <w:shd w:val="clear" w:color="auto" w:fill="FFFFFF"/>
+            <w:tcMar>
+              <w:top w:w="0" w:type="dxa"/>
+              <w:left w:w="0" w:type="dxa"/>
+              <w:bottom w:w="0" w:type="dxa"/>
+              <w:right w:w="0" w:type="dxa"/>
+            </w:tcMar>
+            <w:vAlign w:val="center"/>
+          </w:tcPr>
+          <w:p>
+            <w:pPr>
+              <w:pBdr>
+                <w:top w:val="none" w:sz="0" w:space="0" w:color="000000"/>
+                <w:left w:val="none" w:sz="0" w:space="0" w:color="000000"/>
+                <w:bottom w:val="none" w:sz="0" w:space="0" w:color="000000"/>
+                <w:right w:val="none" w:sz="0" w:space="0" w:color="000000"/>
+              </w:pBdr>
+              <w:spacing w:before="100" w:after="100"/>
+              <w:ind w:left="100" w:right="100"/>
+              <w:jc w:val="center"/>
+              <w:rPr>
+                <w:rFonts w:eastAsia="Helvetica"/>
+                <w:color w:val="000000"/>
+              </w:rPr>
+            </w:pPr>
+          </w:p>
+        </w:tc>
+        <w:tc>
+          <w:tcPr>
+            <w:tcW w:w="1144" w:type="dxa"/>
+            <w:tcBorders>
+              <w:top w:val="single" w:sz="6" w:space="0" w:color="666666"/>
+              <w:left w:val="none" w:sz="0" w:space="0" w:color="000000"/>
+              <w:bottom w:val="single" w:sz="12" w:space="0" w:color="666666"/>
+              <w:right w:val="none" w:sz="0" w:space="0" w:color="000000"/>
+            </w:tcBorders>
+            <w:shd w:val="clear" w:color="auto" w:fill="FFFFFF"/>
+            <w:tcMar>
+              <w:top w:w="0" w:type="dxa"/>
+              <w:left w:w="0" w:type="dxa"/>
+              <w:bottom w:w="0" w:type="dxa"/>
+              <w:right w:w="0" w:type="dxa"/>
+            </w:tcMar>
+            <w:vAlign w:val="center"/>
+          </w:tcPr>
+          <w:p>
+            <w:pPr>
+              <w:pBdr>
+                <w:top w:val="none" w:sz="0" w:space="0" w:color="000000"/>
+                <w:left w:val="none" w:sz="0" w:space="0" w:color="000000"/>
+                <w:bottom w:val="none" w:sz="0" w:space="0" w:color="000000"/>
+                <w:right w:val="none" w:sz="0" w:space="0" w:color="000000"/>
+              </w:pBdr>
+              <w:spacing w:before="100" w:after="100"/>
+              <w:ind w:left="100" w:right="100"/>
+              <w:jc w:val="center"/>
+              <w:rPr>
+                <w:rFonts w:eastAsia="Helvetica"/>
+                <w:color w:val="000000"/>
+              </w:rPr>
+            </w:pPr>
+          </w:p>
+        </w:tc>
+        <w:tc>
+          <w:tcPr>
+            <w:tcW w:w="1080" w:type="dxa"/>
+            <w:tcBorders>
+              <w:top w:val="single" w:sz="6" w:space="0" w:color="666666"/>
+              <w:left w:val="none" w:sz="0" w:space="0" w:color="000000"/>
+              <w:bottom w:val="single" w:sz="12" w:space="0" w:color="666666"/>
+              <w:right w:val="none" w:sz="0" w:space="0" w:color="000000"/>
+            </w:tcBorders>
+            <w:shd w:val="clear" w:color="auto" w:fill="FFFFFF"/>
+            <w:tcMar>
+              <w:top w:w="0" w:type="dxa"/>
+              <w:left w:w="0" w:type="dxa"/>
+              <w:bottom w:w="0" w:type="dxa"/>
+              <w:right w:w="0" w:type="dxa"/>
+            </w:tcMar>
+            <w:vAlign w:val="center"/>
+          </w:tcPr>
+          <w:p>
+            <w:pPr>
+              <w:pBdr>
+                <w:top w:val="none" w:sz="0" w:space="0" w:color="000000"/>
+                <w:left w:val="none" w:sz="0" w:space="0" w:color="000000"/>
+                <w:bottom w:val="none" w:sz="0" w:space="0" w:color="000000"/>
+                <w:right w:val="none" w:sz="0" w:space="0" w:color="000000"/>
+              </w:pBdr>
+              <w:spacing w:before="100" w:after="100"/>
+              <w:ind w:left="100" w:right="100"/>
+              <w:jc w:val="center"/>
+              <w:rPr>
+                <w:rFonts w:eastAsia="Helvetica"/>
+                <w:color w:val="000000"/>
+              </w:rPr>
+            </w:pPr>
+          </w:p>
+        </w:tc>
+      </w:tr>
+      <w:tr>
+        <w:trPr>
+          <w:jc w:val="center"/>
+        </w:trPr>
+        <w:tc>
+          <w:tcPr>
+            <w:tcW w:w="9748" w:type="dxa"/>
+            <w:gridSpan w:val="6"/>
+            <w:tcBorders>
+              <w:top w:val="single" w:sz="12" w:space="0" w:color="666666"/>
+              <w:left w:val="none" w:sz="0" w:space="0" w:color="000000"/>
+              <w:bottom w:val="single" w:sz="6" w:space="0" w:color="666666"/>
+              <w:right w:val="none" w:sz="0" w:space="0" w:color="000000"/>
+            </w:tcBorders>
+            <w:shd w:val="clear" w:color="auto" w:fill="FFFFFF"/>
+            <w:tcMar>
+              <w:top w:w="0" w:type="dxa"/>
+              <w:left w:w="0" w:type="dxa"/>
+              <w:bottom w:w="0" w:type="dxa"/>
+              <w:right w:w="0" w:type="dxa"/>
+            </w:tcMar>
+            <w:vAlign w:val="center"/>
+          </w:tcPr>
+          <w:p>
+            <w:pPr>
+              <w:pBdr>
+                <w:top w:val="none" w:sz="0" w:space="0" w:color="000000"/>
+                <w:left w:val="none" w:sz="0" w:space="0" w:color="000000"/>
+                <w:bottom w:val="none" w:sz="0" w:space="0" w:color="000000"/>
+                <w:right w:val="none" w:sz="0" w:space="0" w:color="000000"/>
+              </w:pBdr>
+              <w:spacing w:before="100" w:after="100"/>
+              <w:ind w:left="100" w:right="100"/>
+              <w:rPr>
+                <w:rFonts w:eastAsia="Helvetica"/>
+                <w:color w:val="000000"/>
+              </w:rPr>
+            </w:pPr>
+            <w:r>
+              <w:rPr>
+                <w:rFonts w:eastAsia="Helvetica"/>
+                <w:color w:val="000000"/>
+              </w:rPr>
+              <w:t>*** p &lt; 0.001  |  ** p &lt; 0.01  |  * p &lt; 0.05  |  . p &lt; 0.10</w:t>
+            </w:r>
+          </w:p>
+        </w:tc>
+      </w:tr>
+    </w:tbl>
+    <w:p>
+      <w:pPr>
+        <w:pStyle w:val="NormalWeb"/>
+      </w:pPr>
+      <w:r>
+        <w:t>El Modelo 4 amplía la especificación ya que incluye variables adicionales como Flights_to_Nashville, Google_Trends_Opry, dummies de eventos (thanksgiving, week_before_christmas, two_weeks_before_christmas) y la variable creada denominada temporada_alta.</w:t>
+      </w:r>
+    </w:p>
+    <w:p>
+      <w:pPr>
+        <w:pStyle w:val="NormalWeb"/>
+      </w:pPr>
+      <w:r>
+        <w:t>El coeficiente de Gasto_Publicidad mantiene un efecto positivo y estadísticamente significativo (p = 0.0435), lo que confirma que la inversión en publicidad sigue siendo un muy relevante para las ventas. Por su parte, la variable Holliday_seasson continúa siendo altamente significativa (p &lt; 0.001), mostrando que la temporada baja tiene un impacto negativo importante sobre las ventas.</w:t>
+      </w:r>
+    </w:p>
+    <w:p>
+      <w:pPr>
+        <w:pStyle w:val="NormalWeb"/>
+      </w:pPr>
+      <w:r>
+        <w:t>Sin embargo, la mayoría de las variables adicionales incluidas en el modelo no resultan estadísticamente significativas, entre ellas Flights_to_Nashville, Google_Trends_Opry, las dummies de eventos específicos y la variable temporada_alta (p = 0.1736). Esto indica que, una vez se controla por la publicidad y la estacionalidad, estas variables no aportan evidencia suficiente para explicar variaciones adicionales en las ventas.</w:t>
+      </w:r>
+    </w:p>
+    <w:p>
+      <w:pPr>
+        <w:pStyle w:val="NormalWeb"/>
+      </w:pPr>
+      <w:r>
+        <w:t>El R² del modelo aumenta a aproximadamente 0.416, lo que representa una mejora marginal frente al modelo anterior (0.395). Esto indica que la inclusión de variables adicionales no genera un incremento sustancial en la capacidad explicativa del modelo.</w:t>
+      </w:r>
+    </w:p>
+    <w:p>
+      <w:pPr>
+        <w:pStyle w:val="NormalWeb"/>
+      </w:pPr>
+      <w:r>
+        <w:t>En consecuencia, el Modelo 4 podría tener un sobreajuste al incluir variables que no contribuyen significativamente.</w:t>
+      </w:r>
+    </w:p>
+    <w:p>
+      <w:pPr>
+        <w:pStyle w:val="NormalWeb"/>
+        <w:rPr>
+          <w:b/>
+          <w:bCs/>
+        </w:rPr>
+      </w:pPr>
+      <w:r>
+        <w:rPr>
+          <w:b/>
+          <w:bCs/>
+        </w:rPr>
+        <w:t>Punto 7</w:t>
+      </w:r>
+    </w:p>
+    <w:p>
+      <w:pPr>
+        <w:pStyle w:val="NormalWeb"/>
+      </w:pPr>
+      <w:r>
+        <w:t>El modelo tiene varias limitaciones que se deben considerar al realizar la interpretación los resultados. En primer lugar, el tamaño de la muestra es relativamente reducido, lo que puede limitar la precisión de las estimaciones y la capacidad para detectar efectos estadísticamente significativos en algunas variables.</w:t>
+      </w:r>
+    </w:p>
+    <w:p>
+      <w:pPr>
+        <w:pStyle w:val="NormalWeb"/>
+      </w:pPr>
+      <w:r>
+        <w:t xml:space="preserve">También, existe la posibilidad de multicolinealidad entre variables independientes, especialmente entre aquellas que capturan el interés turístico hacia Nashville, como </w:t>
+      </w:r>
+      <w:r>
+        <w:lastRenderedPageBreak/>
+        <w:t>Flights_to_Nashville y Google_Trends_Opry. Esto puede inflar los errores estándar y dificultar la identificación del efecto individual de cada variable.</w:t>
+      </w:r>
+    </w:p>
+    <w:p>
+      <w:pPr>
+        <w:pStyle w:val="NormalWeb"/>
+      </w:pPr>
+      <w:r>
+        <w:t>Adicionalmente, el modelo asume una relación lineal en logaritmos entre las variables independientes y las ventas, lo cual puede no capturar posibles efectos no lineales, como rendimientos decrecientes del gasto en publicidad.</w:t>
+      </w:r>
+    </w:p>
+    <w:p>
+      <w:pPr>
+        <w:pStyle w:val="NormalWeb"/>
+      </w:pPr>
+      <w:r>
+        <w:t>Además, es importante considerar la posible existencia de variables omitidas, como condiciones climáticas, eventos especiales en la ciudad o factores competitivos, que podrían influir en las ventas y no están incluidos en el modelo.</w:t>
+      </w:r>
+    </w:p>
+    <w:p>
+      <w:pPr>
+        <w:pStyle w:val="NormalWeb"/>
+      </w:pPr>
+      <w:r>
+        <w:t>Por otro lado, los resultados evidencian que las variables más relevantes para explicar las ventas son el gasto en publicidad y la estacionalidad, mientras que otras variables incluidas en el modelo no aportan significativamente a la explicación. Esto sugiere que un modelo más simple y parsimonioso podría ser más adecuado.</w:t>
+      </w:r>
+    </w:p>
+    <w:p>
+      <w:pPr>
+        <w:pStyle w:val="NormalWeb"/>
+      </w:pPr>
+      <w:r>
+        <w:t>Desde una perspectiva de negocio, los resultados indican que la estrategia debería centrarse principalmente en la optimización del gasto publicitario y en la gestión de los efectos estacionales, en lugar de depender de variables externas como tendencias de búsqueda o flujo de vuelos.</w:t>
+      </w:r>
+    </w:p>
+    <w:p>
+      <w:pPr>
+        <w:pStyle w:val="NormalWeb"/>
+      </w:pPr>
+      <w:r>
+        <w:t>Finalmente, es importante resaltar que los resultados obtenidos representan relaciones de asociación y no necesariamente relaciones causales, por lo que deben interpretarse con cautela al momento de tomar decisiones estratégicas.</w:t>
+      </w:r>
+    </w:p>
+    <w:p>
+      <w:pPr>
+        <w:spacing w:before="100" w:beforeAutospacing="1" w:after="100" w:afterAutospacing="1"/>
+        <w:ind w:left="720"/>
+        <w:jc w:val="both"/>
+      </w:pPr>
     </w:p>
     <w:p>
       <w:pPr>
@@ -3589,7 +6709,7 @@
       <w:iCs/>
     </w:rPr>
   </w:style>
-  <w:style w:type="character" w:styleId="Fuerte">
+  <w:style w:type="character" w:styleId="Textoennegrita">
     <w:name w:val="Strong"/>
     <w:basedOn w:val="Fuentedeprrafopredeter"/>
     <w:uiPriority w:val="22"/>
@@ -3610,6 +6730,21 @@
     <w:pPr>
       <w:spacing w:before="100" w:beforeAutospacing="1" w:after="100" w:afterAutospacing="1"/>
     </w:pPr>
+  </w:style>
+  <w:style w:type="paragraph" w:customStyle="1" w:styleId="TableCaption">
+    <w:name w:val="Table Caption"/>
+    <w:basedOn w:val="Normal"/>
+    <w:qFormat/>
+    <w:rsid w:val="00254ED5"/>
+    <w:pPr>
+      <w:jc w:val="center"/>
+    </w:pPr>
+    <w:rPr>
+      <w:rFonts w:asciiTheme="minorHAnsi" w:eastAsiaTheme="minorEastAsia" w:hAnsiTheme="minorHAnsi" w:cstheme="minorBidi"/>
+      <w:b/>
+      <w:i/>
+      <w:lang w:val="en-US" w:eastAsia="en-US"/>
+    </w:rPr>
   </w:style>
 </w:styles>
 </file>

</xml_diff>